<commit_message>
2025-12-18 Versione  con database ok  per android- aperture db ristrutturate- sviluppato l'inserimento nuovi db di catalogo
</commit_message>
<xml_diff>
--- a/Assets/Procedura per caricare su macchina android jamsetgemini dopo una generazione build.docx
+++ b/Assets/Procedura per caricare su macchina android jamsetgemini dopo una generazione build.docx
@@ -6,7 +6,6 @@
       <w:pPr>
         <w:pStyle w:val="Titolo2"/>
       </w:pPr>
-      <w:bookmarkStart w:id="0" w:name="_GoBack"/>
       <w:r>
         <w:t>P</w:t>
       </w:r>
@@ -35,7 +34,6 @@
       </w:r>
       <w:proofErr w:type="spellEnd"/>
     </w:p>
-    <w:bookmarkEnd w:id="0"/>
     <w:p>
       <w:pPr>
         <w:shd w:val="clear" w:color="auto" w:fill="FFFFFF"/>
@@ -6056,6 +6054,3137 @@
         <w:t>) che è il formato richiesto da Google Play.</w:t>
       </w:r>
     </w:p>
+    <w:p>
+      <w:r>
+        <w:br w:type="page"/>
+      </w:r>
+    </w:p>
+    <w:p>
+      <w:pPr>
+        <w:pStyle w:val="Titolo1"/>
+        <w:rPr>
+          <w:rFonts w:eastAsia="Times New Roman"/>
+          <w:sz w:val="24"/>
+          <w:szCs w:val="24"/>
+          <w:lang w:eastAsia="it-IT"/>
+        </w:rPr>
+      </w:pPr>
+      <w:bookmarkStart w:id="0" w:name="_GoBack"/>
+      <w:r>
+        <w:rPr>
+          <w:shd w:val="clear" w:color="auto" w:fill="EDF3FE"/>
+        </w:rPr>
+        <w:lastRenderedPageBreak/>
+        <w:t xml:space="preserve">nella macchina che </w:t>
+      </w:r>
+      <w:proofErr w:type="gramStart"/>
+      <w:r>
+        <w:rPr>
+          <w:shd w:val="clear" w:color="auto" w:fill="EDF3FE"/>
+        </w:rPr>
+        <w:t>riceve ,</w:t>
+      </w:r>
+      <w:proofErr w:type="gramEnd"/>
+      <w:r>
+        <w:rPr>
+          <w:shd w:val="clear" w:color="auto" w:fill="EDF3FE"/>
+        </w:rPr>
+        <w:t xml:space="preserve"> </w:t>
+      </w:r>
+      <w:r>
+        <w:rPr>
+          <w:shd w:val="clear" w:color="auto" w:fill="EDF3FE"/>
+        </w:rPr>
+        <w:t xml:space="preserve">il tutto si è bloccato perché non sono stati </w:t>
+      </w:r>
+      <w:bookmarkEnd w:id="0"/>
+      <w:r>
+        <w:rPr>
+          <w:shd w:val="clear" w:color="auto" w:fill="EDF3FE"/>
+        </w:rPr>
+        <w:t>trovati i file VCRUNTIME140_1 e MSVCP140. Mi chiede di provare a reinstallare il programma. Ma il blocco si ripete</w:t>
+      </w:r>
+    </w:p>
+    <w:p>
+      <w:pPr>
+        <w:shd w:val="clear" w:color="auto" w:fill="FFFFFF"/>
+        <w:spacing w:before="100" w:beforeAutospacing="1" w:after="240" w:line="240" w:lineRule="auto"/>
+        <w:rPr>
+          <w:rFonts w:ascii="Segoe UI" w:eastAsia="Times New Roman" w:hAnsi="Segoe UI" w:cs="Segoe UI"/>
+          <w:color w:val="0F1115"/>
+          <w:sz w:val="24"/>
+          <w:szCs w:val="24"/>
+          <w:lang w:eastAsia="it-IT"/>
+        </w:rPr>
+      </w:pPr>
+      <w:r>
+        <w:rPr>
+          <w:rFonts w:ascii="Segoe UI" w:eastAsia="Times New Roman" w:hAnsi="Segoe UI" w:cs="Segoe UI"/>
+          <w:color w:val="0F1115"/>
+          <w:sz w:val="24"/>
+          <w:szCs w:val="24"/>
+          <w:lang w:eastAsia="it-IT"/>
+        </w:rPr>
+        <w:t xml:space="preserve">Questo è un problema comune quando si distribuiscono </w:t>
+      </w:r>
+      <w:proofErr w:type="spellStart"/>
+      <w:r>
+        <w:rPr>
+          <w:rFonts w:ascii="Segoe UI" w:eastAsia="Times New Roman" w:hAnsi="Segoe UI" w:cs="Segoe UI"/>
+          <w:color w:val="0F1115"/>
+          <w:sz w:val="24"/>
+          <w:szCs w:val="24"/>
+          <w:lang w:eastAsia="it-IT"/>
+        </w:rPr>
+        <w:t>app</w:t>
+      </w:r>
+      <w:proofErr w:type="spellEnd"/>
+      <w:r>
+        <w:rPr>
+          <w:rFonts w:ascii="Segoe UI" w:eastAsia="Times New Roman" w:hAnsi="Segoe UI" w:cs="Segoe UI"/>
+          <w:color w:val="0F1115"/>
+          <w:sz w:val="24"/>
+          <w:szCs w:val="24"/>
+          <w:lang w:eastAsia="it-IT"/>
+        </w:rPr>
+        <w:t xml:space="preserve"> C++/Java su Windows. I file mancanti fanno parte dei </w:t>
+      </w:r>
+      <w:r>
+        <w:rPr>
+          <w:rFonts w:ascii="Segoe UI" w:eastAsia="Times New Roman" w:hAnsi="Segoe UI" w:cs="Segoe UI"/>
+          <w:b/>
+          <w:bCs/>
+          <w:color w:val="0F1115"/>
+          <w:sz w:val="24"/>
+          <w:szCs w:val="24"/>
+          <w:lang w:eastAsia="it-IT"/>
+        </w:rPr>
+        <w:t xml:space="preserve">Visual C++ </w:t>
+      </w:r>
+      <w:proofErr w:type="spellStart"/>
+      <w:r>
+        <w:rPr>
+          <w:rFonts w:ascii="Segoe UI" w:eastAsia="Times New Roman" w:hAnsi="Segoe UI" w:cs="Segoe UI"/>
+          <w:b/>
+          <w:bCs/>
+          <w:color w:val="0F1115"/>
+          <w:sz w:val="24"/>
+          <w:szCs w:val="24"/>
+          <w:lang w:eastAsia="it-IT"/>
+        </w:rPr>
+        <w:t>Redistributible</w:t>
+      </w:r>
+      <w:proofErr w:type="spellEnd"/>
+      <w:r>
+        <w:rPr>
+          <w:rFonts w:ascii="Segoe UI" w:eastAsia="Times New Roman" w:hAnsi="Segoe UI" w:cs="Segoe UI"/>
+          <w:b/>
+          <w:bCs/>
+          <w:color w:val="0F1115"/>
+          <w:sz w:val="24"/>
+          <w:szCs w:val="24"/>
+          <w:lang w:eastAsia="it-IT"/>
+        </w:rPr>
+        <w:t xml:space="preserve"> </w:t>
+      </w:r>
+      <w:proofErr w:type="spellStart"/>
+      <w:r>
+        <w:rPr>
+          <w:rFonts w:ascii="Segoe UI" w:eastAsia="Times New Roman" w:hAnsi="Segoe UI" w:cs="Segoe UI"/>
+          <w:b/>
+          <w:bCs/>
+          <w:color w:val="0F1115"/>
+          <w:sz w:val="24"/>
+          <w:szCs w:val="24"/>
+          <w:lang w:eastAsia="it-IT"/>
+        </w:rPr>
+        <w:t>Runtimes</w:t>
+      </w:r>
+      <w:proofErr w:type="spellEnd"/>
+      <w:r>
+        <w:rPr>
+          <w:rFonts w:ascii="Segoe UI" w:eastAsia="Times New Roman" w:hAnsi="Segoe UI" w:cs="Segoe UI"/>
+          <w:color w:val="0F1115"/>
+          <w:sz w:val="24"/>
+          <w:szCs w:val="24"/>
+          <w:lang w:eastAsia="it-IT"/>
+        </w:rPr>
+        <w:t> di Microsoft.</w:t>
+      </w:r>
+    </w:p>
+    <w:p>
+      <w:pPr>
+        <w:shd w:val="clear" w:color="auto" w:fill="FFFFFF"/>
+        <w:spacing w:before="240" w:after="240" w:line="240" w:lineRule="auto"/>
+        <w:rPr>
+          <w:rFonts w:ascii="Segoe UI" w:eastAsia="Times New Roman" w:hAnsi="Segoe UI" w:cs="Segoe UI"/>
+          <w:color w:val="0F1115"/>
+          <w:sz w:val="24"/>
+          <w:szCs w:val="24"/>
+          <w:lang w:eastAsia="it-IT"/>
+        </w:rPr>
+      </w:pPr>
+      <w:r>
+        <w:rPr>
+          <w:rFonts w:ascii="Segoe UI" w:eastAsia="Times New Roman" w:hAnsi="Segoe UI" w:cs="Segoe UI"/>
+          <w:color w:val="0F1115"/>
+          <w:sz w:val="24"/>
+          <w:szCs w:val="24"/>
+          <w:lang w:eastAsia="it-IT"/>
+        </w:rPr>
+        <w:t>Ecco le soluzioni:</w:t>
+      </w:r>
+    </w:p>
+    <w:p>
+      <w:pPr>
+        <w:shd w:val="clear" w:color="auto" w:fill="FFFFFF"/>
+        <w:spacing w:before="480" w:after="240" w:line="480" w:lineRule="atLeast"/>
+        <w:outlineLvl w:val="1"/>
+        <w:rPr>
+          <w:rFonts w:ascii="Segoe UI" w:eastAsia="Times New Roman" w:hAnsi="Segoe UI" w:cs="Segoe UI"/>
+          <w:b/>
+          <w:bCs/>
+          <w:color w:val="0F1115"/>
+          <w:sz w:val="33"/>
+          <w:szCs w:val="33"/>
+          <w:lang w:eastAsia="it-IT"/>
+        </w:rPr>
+      </w:pPr>
+      <w:r>
+        <w:rPr>
+          <w:rFonts w:ascii="Segoe UI" w:eastAsia="Times New Roman" w:hAnsi="Segoe UI" w:cs="Segoe UI"/>
+          <w:b/>
+          <w:bCs/>
+          <w:color w:val="0F1115"/>
+          <w:sz w:val="33"/>
+          <w:szCs w:val="33"/>
+          <w:lang w:eastAsia="it-IT"/>
+        </w:rPr>
+        <w:t xml:space="preserve">Soluzione 1: Installare i </w:t>
+      </w:r>
+      <w:proofErr w:type="spellStart"/>
+      <w:r>
+        <w:rPr>
+          <w:rFonts w:ascii="Segoe UI" w:eastAsia="Times New Roman" w:hAnsi="Segoe UI" w:cs="Segoe UI"/>
+          <w:b/>
+          <w:bCs/>
+          <w:color w:val="0F1115"/>
+          <w:sz w:val="33"/>
+          <w:szCs w:val="33"/>
+          <w:lang w:eastAsia="it-IT"/>
+        </w:rPr>
+        <w:t>Redistributibili</w:t>
+      </w:r>
+      <w:proofErr w:type="spellEnd"/>
+      <w:r>
+        <w:rPr>
+          <w:rFonts w:ascii="Segoe UI" w:eastAsia="Times New Roman" w:hAnsi="Segoe UI" w:cs="Segoe UI"/>
+          <w:b/>
+          <w:bCs/>
+          <w:color w:val="0F1115"/>
+          <w:sz w:val="33"/>
+          <w:szCs w:val="33"/>
+          <w:lang w:eastAsia="it-IT"/>
+        </w:rPr>
+        <w:t xml:space="preserve"> di Visual C++ (Raccomandata)</w:t>
+      </w:r>
+    </w:p>
+    <w:p>
+      <w:pPr>
+        <w:numPr>
+          <w:ilvl w:val="0"/>
+          <w:numId w:val="6"/>
+        </w:numPr>
+        <w:shd w:val="clear" w:color="auto" w:fill="FFFFFF"/>
+        <w:spacing w:before="100" w:beforeAutospacing="1" w:after="120" w:line="240" w:lineRule="auto"/>
+        <w:ind w:left="0"/>
+        <w:rPr>
+          <w:rFonts w:ascii="Segoe UI" w:eastAsia="Times New Roman" w:hAnsi="Segoe UI" w:cs="Segoe UI"/>
+          <w:color w:val="0F1115"/>
+          <w:sz w:val="24"/>
+          <w:szCs w:val="24"/>
+          <w:lang w:eastAsia="it-IT"/>
+        </w:rPr>
+      </w:pPr>
+      <w:r>
+        <w:rPr>
+          <w:rFonts w:ascii="Segoe UI" w:eastAsia="Times New Roman" w:hAnsi="Segoe UI" w:cs="Segoe UI"/>
+          <w:b/>
+          <w:bCs/>
+          <w:color w:val="0F1115"/>
+          <w:sz w:val="24"/>
+          <w:szCs w:val="24"/>
+          <w:lang w:eastAsia="it-IT"/>
+        </w:rPr>
+        <w:t>Scarica e installa il pacchetto più recente</w:t>
+      </w:r>
+      <w:r>
+        <w:rPr>
+          <w:rFonts w:ascii="Segoe UI" w:eastAsia="Times New Roman" w:hAnsi="Segoe UI" w:cs="Segoe UI"/>
+          <w:color w:val="0F1115"/>
+          <w:sz w:val="24"/>
+          <w:szCs w:val="24"/>
+          <w:lang w:eastAsia="it-IT"/>
+        </w:rPr>
+        <w:t>:</w:t>
+      </w:r>
+    </w:p>
+    <w:p>
+      <w:pPr>
+        <w:numPr>
+          <w:ilvl w:val="1"/>
+          <w:numId w:val="6"/>
+        </w:numPr>
+        <w:shd w:val="clear" w:color="auto" w:fill="FFFFFF"/>
+        <w:spacing w:before="100" w:beforeAutospacing="1" w:after="0" w:line="240" w:lineRule="auto"/>
+        <w:ind w:left="0"/>
+        <w:rPr>
+          <w:rFonts w:ascii="Segoe UI" w:eastAsia="Times New Roman" w:hAnsi="Segoe UI" w:cs="Segoe UI"/>
+          <w:color w:val="0F1115"/>
+          <w:sz w:val="24"/>
+          <w:szCs w:val="24"/>
+          <w:lang w:eastAsia="it-IT"/>
+        </w:rPr>
+      </w:pPr>
+      <w:r>
+        <w:rPr>
+          <w:rFonts w:ascii="Segoe UI" w:eastAsia="Times New Roman" w:hAnsi="Segoe UI" w:cs="Segoe UI"/>
+          <w:color w:val="0F1115"/>
+          <w:sz w:val="24"/>
+          <w:szCs w:val="24"/>
+          <w:lang w:eastAsia="it-IT"/>
+        </w:rPr>
+        <w:t>Vai alla pagina ufficiale Microsoft: </w:t>
+      </w:r>
+      <w:hyperlink r:id="rId5" w:tgtFrame="_blank" w:history="1">
+        <w:r>
+          <w:rPr>
+            <w:rFonts w:ascii="Segoe UI" w:eastAsia="Times New Roman" w:hAnsi="Segoe UI" w:cs="Segoe UI"/>
+            <w:color w:val="3964FE"/>
+            <w:sz w:val="24"/>
+            <w:szCs w:val="24"/>
+            <w:u w:val="single"/>
+            <w:bdr w:val="single" w:sz="12" w:space="0" w:color="auto" w:frame="1"/>
+            <w:lang w:eastAsia="it-IT"/>
+          </w:rPr>
+          <w:t>https://aka.ms/vs/17/release/vc_redist.x64.exe</w:t>
+        </w:r>
+      </w:hyperlink>
+      <w:r>
+        <w:rPr>
+          <w:rFonts w:ascii="Segoe UI" w:eastAsia="Times New Roman" w:hAnsi="Segoe UI" w:cs="Segoe UI"/>
+          <w:color w:val="0F1115"/>
+          <w:sz w:val="24"/>
+          <w:szCs w:val="24"/>
+          <w:lang w:eastAsia="it-IT"/>
+        </w:rPr>
+        <w:t> (per 64-bit)</w:t>
+      </w:r>
+    </w:p>
+    <w:p>
+      <w:pPr>
+        <w:numPr>
+          <w:ilvl w:val="1"/>
+          <w:numId w:val="6"/>
+        </w:numPr>
+        <w:shd w:val="clear" w:color="auto" w:fill="FFFFFF"/>
+        <w:spacing w:before="100" w:beforeAutospacing="1" w:after="0" w:line="240" w:lineRule="auto"/>
+        <w:ind w:left="0"/>
+        <w:rPr>
+          <w:rFonts w:ascii="Segoe UI" w:eastAsia="Times New Roman" w:hAnsi="Segoe UI" w:cs="Segoe UI"/>
+          <w:color w:val="0F1115"/>
+          <w:sz w:val="24"/>
+          <w:szCs w:val="24"/>
+          <w:lang w:val="en-GB" w:eastAsia="it-IT"/>
+        </w:rPr>
+      </w:pPr>
+      <w:proofErr w:type="spellStart"/>
+      <w:r>
+        <w:rPr>
+          <w:rFonts w:ascii="Segoe UI" w:eastAsia="Times New Roman" w:hAnsi="Segoe UI" w:cs="Segoe UI"/>
+          <w:color w:val="0F1115"/>
+          <w:sz w:val="24"/>
+          <w:szCs w:val="24"/>
+          <w:lang w:val="en-GB" w:eastAsia="it-IT"/>
+        </w:rPr>
+        <w:t>Oppure</w:t>
+      </w:r>
+      <w:proofErr w:type="spellEnd"/>
+      <w:r>
+        <w:rPr>
+          <w:rFonts w:ascii="Segoe UI" w:eastAsia="Times New Roman" w:hAnsi="Segoe UI" w:cs="Segoe UI"/>
+          <w:color w:val="0F1115"/>
+          <w:sz w:val="24"/>
+          <w:szCs w:val="24"/>
+          <w:lang w:val="en-GB" w:eastAsia="it-IT"/>
+        </w:rPr>
+        <w:t> </w:t>
+      </w:r>
+      <w:hyperlink r:id="rId6" w:tgtFrame="_blank" w:history="1">
+        <w:r>
+          <w:rPr>
+            <w:rFonts w:ascii="Segoe UI" w:eastAsia="Times New Roman" w:hAnsi="Segoe UI" w:cs="Segoe UI"/>
+            <w:color w:val="3964FE"/>
+            <w:sz w:val="24"/>
+            <w:szCs w:val="24"/>
+            <w:u w:val="single"/>
+            <w:bdr w:val="single" w:sz="12" w:space="0" w:color="auto" w:frame="1"/>
+            <w:lang w:val="en-GB" w:eastAsia="it-IT"/>
+          </w:rPr>
+          <w:t>https://aka.ms/vs/17/release/vc_redist.x86.exe</w:t>
+        </w:r>
+      </w:hyperlink>
+      <w:r>
+        <w:rPr>
+          <w:rFonts w:ascii="Segoe UI" w:eastAsia="Times New Roman" w:hAnsi="Segoe UI" w:cs="Segoe UI"/>
+          <w:color w:val="0F1115"/>
+          <w:sz w:val="24"/>
+          <w:szCs w:val="24"/>
+          <w:lang w:val="en-GB" w:eastAsia="it-IT"/>
+        </w:rPr>
+        <w:t> (per 32-bit)</w:t>
+      </w:r>
+    </w:p>
+    <w:p>
+      <w:pPr>
+        <w:numPr>
+          <w:ilvl w:val="0"/>
+          <w:numId w:val="6"/>
+        </w:numPr>
+        <w:shd w:val="clear" w:color="auto" w:fill="FFFFFF"/>
+        <w:spacing w:before="100" w:beforeAutospacing="1" w:after="120" w:line="240" w:lineRule="auto"/>
+        <w:ind w:left="0"/>
+        <w:rPr>
+          <w:rFonts w:ascii="Segoe UI" w:eastAsia="Times New Roman" w:hAnsi="Segoe UI" w:cs="Segoe UI"/>
+          <w:color w:val="0F1115"/>
+          <w:sz w:val="24"/>
+          <w:szCs w:val="24"/>
+          <w:lang w:eastAsia="it-IT"/>
+        </w:rPr>
+      </w:pPr>
+      <w:r>
+        <w:rPr>
+          <w:rFonts w:ascii="Segoe UI" w:eastAsia="Times New Roman" w:hAnsi="Segoe UI" w:cs="Segoe UI"/>
+          <w:b/>
+          <w:bCs/>
+          <w:color w:val="0F1115"/>
+          <w:sz w:val="24"/>
+          <w:szCs w:val="24"/>
+          <w:lang w:eastAsia="it-IT"/>
+        </w:rPr>
+        <w:t>Installa entrambe le versioni</w:t>
+      </w:r>
+      <w:r>
+        <w:rPr>
+          <w:rFonts w:ascii="Segoe UI" w:eastAsia="Times New Roman" w:hAnsi="Segoe UI" w:cs="Segoe UI"/>
+          <w:color w:val="0F1115"/>
+          <w:sz w:val="24"/>
+          <w:szCs w:val="24"/>
+          <w:lang w:eastAsia="it-IT"/>
+        </w:rPr>
+        <w:t> se non sei sicuro dell'architettura:</w:t>
+      </w:r>
+    </w:p>
+    <w:p>
+      <w:pPr>
+        <w:numPr>
+          <w:ilvl w:val="1"/>
+          <w:numId w:val="6"/>
+        </w:numPr>
+        <w:shd w:val="clear" w:color="auto" w:fill="FFFFFF"/>
+        <w:spacing w:before="100" w:beforeAutospacing="1" w:after="0" w:line="240" w:lineRule="auto"/>
+        <w:ind w:left="0"/>
+        <w:rPr>
+          <w:rFonts w:ascii="Segoe UI" w:eastAsia="Times New Roman" w:hAnsi="Segoe UI" w:cs="Segoe UI"/>
+          <w:color w:val="0F1115"/>
+          <w:sz w:val="24"/>
+          <w:szCs w:val="24"/>
+          <w:lang w:eastAsia="it-IT"/>
+        </w:rPr>
+      </w:pPr>
+      <w:r>
+        <w:rPr>
+          <w:rFonts w:ascii="Segoe UI" w:eastAsia="Times New Roman" w:hAnsi="Segoe UI" w:cs="Segoe UI"/>
+          <w:color w:val="0F1115"/>
+          <w:sz w:val="24"/>
+          <w:szCs w:val="24"/>
+          <w:lang w:eastAsia="it-IT"/>
+        </w:rPr>
+        <w:t>Installa prima x86 (32-bit)</w:t>
+      </w:r>
+    </w:p>
+    <w:p>
+      <w:pPr>
+        <w:numPr>
+          <w:ilvl w:val="1"/>
+          <w:numId w:val="6"/>
+        </w:numPr>
+        <w:shd w:val="clear" w:color="auto" w:fill="FFFFFF"/>
+        <w:spacing w:before="100" w:beforeAutospacing="1" w:after="0" w:line="240" w:lineRule="auto"/>
+        <w:ind w:left="0"/>
+        <w:rPr>
+          <w:rFonts w:ascii="Segoe UI" w:eastAsia="Times New Roman" w:hAnsi="Segoe UI" w:cs="Segoe UI"/>
+          <w:color w:val="0F1115"/>
+          <w:sz w:val="24"/>
+          <w:szCs w:val="24"/>
+          <w:lang w:eastAsia="it-IT"/>
+        </w:rPr>
+      </w:pPr>
+      <w:r>
+        <w:rPr>
+          <w:rFonts w:ascii="Segoe UI" w:eastAsia="Times New Roman" w:hAnsi="Segoe UI" w:cs="Segoe UI"/>
+          <w:color w:val="0F1115"/>
+          <w:sz w:val="24"/>
+          <w:szCs w:val="24"/>
+          <w:lang w:eastAsia="it-IT"/>
+        </w:rPr>
+        <w:t>Poi x64 (64-bit)</w:t>
+      </w:r>
+    </w:p>
+    <w:p>
+      <w:pPr>
+        <w:numPr>
+          <w:ilvl w:val="1"/>
+          <w:numId w:val="6"/>
+        </w:numPr>
+        <w:shd w:val="clear" w:color="auto" w:fill="FFFFFF"/>
+        <w:spacing w:before="100" w:beforeAutospacing="1" w:after="0" w:line="240" w:lineRule="auto"/>
+        <w:ind w:left="0"/>
+        <w:rPr>
+          <w:rFonts w:ascii="Segoe UI" w:eastAsia="Times New Roman" w:hAnsi="Segoe UI" w:cs="Segoe UI"/>
+          <w:color w:val="0F1115"/>
+          <w:sz w:val="24"/>
+          <w:szCs w:val="24"/>
+          <w:lang w:eastAsia="it-IT"/>
+        </w:rPr>
+      </w:pPr>
+      <w:r>
+        <w:rPr>
+          <w:rFonts w:ascii="Segoe UI" w:eastAsia="Times New Roman" w:hAnsi="Segoe UI" w:cs="Segoe UI"/>
+          <w:color w:val="0F1115"/>
+          <w:sz w:val="24"/>
+          <w:szCs w:val="24"/>
+          <w:lang w:eastAsia="it-IT"/>
+        </w:rPr>
+        <w:t>Non confliggono, possono coesistere</w:t>
+      </w:r>
+    </w:p>
+    <w:p>
+      <w:pPr>
+        <w:shd w:val="clear" w:color="auto" w:fill="FFFFFF"/>
+        <w:spacing w:before="480" w:after="240" w:line="480" w:lineRule="atLeast"/>
+        <w:outlineLvl w:val="1"/>
+        <w:rPr>
+          <w:rFonts w:ascii="Segoe UI" w:eastAsia="Times New Roman" w:hAnsi="Segoe UI" w:cs="Segoe UI"/>
+          <w:b/>
+          <w:bCs/>
+          <w:color w:val="0F1115"/>
+          <w:sz w:val="33"/>
+          <w:szCs w:val="33"/>
+          <w:lang w:eastAsia="it-IT"/>
+        </w:rPr>
+      </w:pPr>
+      <w:r>
+        <w:rPr>
+          <w:rFonts w:ascii="Segoe UI" w:eastAsia="Times New Roman" w:hAnsi="Segoe UI" w:cs="Segoe UI"/>
+          <w:b/>
+          <w:bCs/>
+          <w:color w:val="0F1115"/>
+          <w:sz w:val="33"/>
+          <w:szCs w:val="33"/>
+          <w:lang w:eastAsia="it-IT"/>
+        </w:rPr>
+        <w:t xml:space="preserve">Soluzione 2: Bundle i DLL con la tua </w:t>
+      </w:r>
+      <w:proofErr w:type="spellStart"/>
+      <w:r>
+        <w:rPr>
+          <w:rFonts w:ascii="Segoe UI" w:eastAsia="Times New Roman" w:hAnsi="Segoe UI" w:cs="Segoe UI"/>
+          <w:b/>
+          <w:bCs/>
+          <w:color w:val="0F1115"/>
+          <w:sz w:val="33"/>
+          <w:szCs w:val="33"/>
+          <w:lang w:eastAsia="it-IT"/>
+        </w:rPr>
+        <w:t>app</w:t>
+      </w:r>
+      <w:proofErr w:type="spellEnd"/>
+      <w:r>
+        <w:rPr>
+          <w:rFonts w:ascii="Segoe UI" w:eastAsia="Times New Roman" w:hAnsi="Segoe UI" w:cs="Segoe UI"/>
+          <w:b/>
+          <w:bCs/>
+          <w:color w:val="0F1115"/>
+          <w:sz w:val="33"/>
+          <w:szCs w:val="33"/>
+          <w:lang w:eastAsia="it-IT"/>
+        </w:rPr>
+        <w:t> (Per distribuzione semplice)</w:t>
+      </w:r>
+    </w:p>
+    <w:p>
+      <w:pPr>
+        <w:shd w:val="clear" w:color="auto" w:fill="FFFFFF"/>
+        <w:spacing w:before="240" w:after="240" w:line="240" w:lineRule="auto"/>
+        <w:rPr>
+          <w:rFonts w:ascii="Segoe UI" w:eastAsia="Times New Roman" w:hAnsi="Segoe UI" w:cs="Segoe UI"/>
+          <w:color w:val="0F1115"/>
+          <w:sz w:val="24"/>
+          <w:szCs w:val="24"/>
+          <w:lang w:eastAsia="it-IT"/>
+        </w:rPr>
+      </w:pPr>
+      <w:r>
+        <w:rPr>
+          <w:rFonts w:ascii="Segoe UI" w:eastAsia="Times New Roman" w:hAnsi="Segoe UI" w:cs="Segoe UI"/>
+          <w:color w:val="0F1115"/>
+          <w:sz w:val="24"/>
+          <w:szCs w:val="24"/>
+          <w:lang w:eastAsia="it-IT"/>
+        </w:rPr>
+        <w:t>Nella cartella della tua applicazione, crea una sottocartella con i DLL necessari:</w:t>
+      </w:r>
+    </w:p>
+    <w:p>
+      <w:pPr>
+        <w:numPr>
+          <w:ilvl w:val="0"/>
+          <w:numId w:val="7"/>
+        </w:numPr>
+        <w:shd w:val="clear" w:color="auto" w:fill="FFFFFF"/>
+        <w:spacing w:before="100" w:beforeAutospacing="1" w:after="120" w:line="240" w:lineRule="auto"/>
+        <w:ind w:left="0"/>
+        <w:rPr>
+          <w:rFonts w:ascii="Segoe UI" w:eastAsia="Times New Roman" w:hAnsi="Segoe UI" w:cs="Segoe UI"/>
+          <w:color w:val="0F1115"/>
+          <w:sz w:val="24"/>
+          <w:szCs w:val="24"/>
+          <w:lang w:eastAsia="it-IT"/>
+        </w:rPr>
+      </w:pPr>
+      <w:r>
+        <w:rPr>
+          <w:rFonts w:ascii="Segoe UI" w:eastAsia="Times New Roman" w:hAnsi="Segoe UI" w:cs="Segoe UI"/>
+          <w:color w:val="0F1115"/>
+          <w:sz w:val="24"/>
+          <w:szCs w:val="24"/>
+          <w:lang w:eastAsia="it-IT"/>
+        </w:rPr>
+        <w:t xml:space="preserve">Trova questi file nella tua macchina di sviluppo (dove </w:t>
+      </w:r>
+      <w:proofErr w:type="spellStart"/>
+      <w:r>
+        <w:rPr>
+          <w:rFonts w:ascii="Segoe UI" w:eastAsia="Times New Roman" w:hAnsi="Segoe UI" w:cs="Segoe UI"/>
+          <w:color w:val="0F1115"/>
+          <w:sz w:val="24"/>
+          <w:szCs w:val="24"/>
+          <w:lang w:eastAsia="it-IT"/>
+        </w:rPr>
+        <w:t>Android</w:t>
+      </w:r>
+      <w:proofErr w:type="spellEnd"/>
+      <w:r>
+        <w:rPr>
+          <w:rFonts w:ascii="Segoe UI" w:eastAsia="Times New Roman" w:hAnsi="Segoe UI" w:cs="Segoe UI"/>
+          <w:color w:val="0F1115"/>
+          <w:sz w:val="24"/>
+          <w:szCs w:val="24"/>
+          <w:lang w:eastAsia="it-IT"/>
+        </w:rPr>
+        <w:t xml:space="preserve"> Studio funziona):</w:t>
+      </w:r>
+    </w:p>
+    <w:p>
+      <w:pPr>
+        <w:numPr>
+          <w:ilvl w:val="1"/>
+          <w:numId w:val="7"/>
+        </w:numPr>
+        <w:shd w:val="clear" w:color="auto" w:fill="FFFFFF"/>
+        <w:spacing w:before="100" w:beforeAutospacing="1" w:after="0" w:line="240" w:lineRule="auto"/>
+        <w:ind w:left="0"/>
+        <w:rPr>
+          <w:rFonts w:ascii="Segoe UI" w:eastAsia="Times New Roman" w:hAnsi="Segoe UI" w:cs="Segoe UI"/>
+          <w:color w:val="0F1115"/>
+          <w:sz w:val="24"/>
+          <w:szCs w:val="24"/>
+          <w:lang w:eastAsia="it-IT"/>
+        </w:rPr>
+      </w:pPr>
+      <w:r>
+        <w:rPr>
+          <w:rFonts w:ascii="Consolas" w:eastAsia="Times New Roman" w:hAnsi="Consolas" w:cs="Courier New"/>
+          <w:color w:val="0F1115"/>
+          <w:sz w:val="20"/>
+          <w:szCs w:val="20"/>
+          <w:shd w:val="clear" w:color="auto" w:fill="EBEEF2"/>
+          <w:lang w:eastAsia="it-IT"/>
+        </w:rPr>
+        <w:t>VCRUNTIME140_1.dll</w:t>
+      </w:r>
+    </w:p>
+    <w:p>
+      <w:pPr>
+        <w:numPr>
+          <w:ilvl w:val="1"/>
+          <w:numId w:val="7"/>
+        </w:numPr>
+        <w:shd w:val="clear" w:color="auto" w:fill="FFFFFF"/>
+        <w:spacing w:before="100" w:beforeAutospacing="1" w:after="0" w:line="240" w:lineRule="auto"/>
+        <w:ind w:left="0"/>
+        <w:rPr>
+          <w:rFonts w:ascii="Segoe UI" w:eastAsia="Times New Roman" w:hAnsi="Segoe UI" w:cs="Segoe UI"/>
+          <w:color w:val="0F1115"/>
+          <w:sz w:val="24"/>
+          <w:szCs w:val="24"/>
+          <w:lang w:eastAsia="it-IT"/>
+        </w:rPr>
+      </w:pPr>
+      <w:r>
+        <w:rPr>
+          <w:rFonts w:ascii="Consolas" w:eastAsia="Times New Roman" w:hAnsi="Consolas" w:cs="Courier New"/>
+          <w:color w:val="0F1115"/>
+          <w:sz w:val="20"/>
+          <w:szCs w:val="20"/>
+          <w:shd w:val="clear" w:color="auto" w:fill="EBEEF2"/>
+          <w:lang w:eastAsia="it-IT"/>
+        </w:rPr>
+        <w:t>VCRUNTIME140.dll</w:t>
+      </w:r>
+    </w:p>
+    <w:p>
+      <w:pPr>
+        <w:numPr>
+          <w:ilvl w:val="1"/>
+          <w:numId w:val="7"/>
+        </w:numPr>
+        <w:shd w:val="clear" w:color="auto" w:fill="FFFFFF"/>
+        <w:spacing w:before="100" w:beforeAutospacing="1" w:after="0" w:line="240" w:lineRule="auto"/>
+        <w:ind w:left="0"/>
+        <w:rPr>
+          <w:rFonts w:ascii="Segoe UI" w:eastAsia="Times New Roman" w:hAnsi="Segoe UI" w:cs="Segoe UI"/>
+          <w:color w:val="0F1115"/>
+          <w:sz w:val="24"/>
+          <w:szCs w:val="24"/>
+          <w:lang w:eastAsia="it-IT"/>
+        </w:rPr>
+      </w:pPr>
+      <w:r>
+        <w:rPr>
+          <w:rFonts w:ascii="Consolas" w:eastAsia="Times New Roman" w:hAnsi="Consolas" w:cs="Courier New"/>
+          <w:color w:val="0F1115"/>
+          <w:sz w:val="20"/>
+          <w:szCs w:val="20"/>
+          <w:shd w:val="clear" w:color="auto" w:fill="EBEEF2"/>
+          <w:lang w:eastAsia="it-IT"/>
+        </w:rPr>
+        <w:t>MSVCP140.dll</w:t>
+      </w:r>
+    </w:p>
+    <w:p>
+      <w:pPr>
+        <w:numPr>
+          <w:ilvl w:val="1"/>
+          <w:numId w:val="7"/>
+        </w:numPr>
+        <w:shd w:val="clear" w:color="auto" w:fill="FFFFFF"/>
+        <w:spacing w:before="100" w:beforeAutospacing="1" w:after="0" w:line="240" w:lineRule="auto"/>
+        <w:ind w:left="0"/>
+        <w:rPr>
+          <w:rFonts w:ascii="Segoe UI" w:eastAsia="Times New Roman" w:hAnsi="Segoe UI" w:cs="Segoe UI"/>
+          <w:color w:val="0F1115"/>
+          <w:sz w:val="24"/>
+          <w:szCs w:val="24"/>
+          <w:lang w:eastAsia="it-IT"/>
+        </w:rPr>
+      </w:pPr>
+      <w:r>
+        <w:rPr>
+          <w:rFonts w:ascii="Consolas" w:eastAsia="Times New Roman" w:hAnsi="Consolas" w:cs="Courier New"/>
+          <w:color w:val="0F1115"/>
+          <w:sz w:val="20"/>
+          <w:szCs w:val="20"/>
+          <w:shd w:val="clear" w:color="auto" w:fill="EBEEF2"/>
+          <w:lang w:eastAsia="it-IT"/>
+        </w:rPr>
+        <w:t>vcruntime140.dll</w:t>
+      </w:r>
+    </w:p>
+    <w:p>
+      <w:pPr>
+        <w:numPr>
+          <w:ilvl w:val="0"/>
+          <w:numId w:val="7"/>
+        </w:numPr>
+        <w:shd w:val="clear" w:color="auto" w:fill="FFFFFF"/>
+        <w:spacing w:before="100" w:beforeAutospacing="1" w:after="120" w:line="240" w:lineRule="auto"/>
+        <w:ind w:left="0"/>
+        <w:rPr>
+          <w:rFonts w:ascii="Segoe UI" w:eastAsia="Times New Roman" w:hAnsi="Segoe UI" w:cs="Segoe UI"/>
+          <w:color w:val="0F1115"/>
+          <w:sz w:val="24"/>
+          <w:szCs w:val="24"/>
+          <w:lang w:eastAsia="it-IT"/>
+        </w:rPr>
+      </w:pPr>
+      <w:r>
+        <w:rPr>
+          <w:rFonts w:ascii="Segoe UI" w:eastAsia="Times New Roman" w:hAnsi="Segoe UI" w:cs="Segoe UI"/>
+          <w:color w:val="0F1115"/>
+          <w:sz w:val="24"/>
+          <w:szCs w:val="24"/>
+          <w:lang w:eastAsia="it-IT"/>
+        </w:rPr>
+        <w:t>Solitamente si trovano in:</w:t>
+      </w:r>
+    </w:p>
+    <w:p>
+      <w:pPr>
+        <w:shd w:val="clear" w:color="auto" w:fill="FFFFFF"/>
+        <w:spacing w:after="0" w:afterAutospacing="1" w:line="189" w:lineRule="atLeast"/>
+        <w:rPr>
+          <w:rFonts w:ascii="Segoe UI" w:eastAsia="Times New Roman" w:hAnsi="Segoe UI" w:cs="Segoe UI"/>
+          <w:color w:val="0F1115"/>
+          <w:sz w:val="19"/>
+          <w:szCs w:val="19"/>
+          <w:lang w:eastAsia="it-IT"/>
+        </w:rPr>
+      </w:pPr>
+      <w:r>
+        <w:rPr>
+          <w:rFonts w:ascii="Consolas" w:eastAsia="Times New Roman" w:hAnsi="Consolas" w:cs="Segoe UI"/>
+          <w:color w:val="0F1115"/>
+          <w:sz w:val="18"/>
+          <w:szCs w:val="18"/>
+          <w:lang w:eastAsia="it-IT"/>
+        </w:rPr>
+        <w:t>text</w:t>
+      </w:r>
+    </w:p>
+    <w:p>
+      <w:pPr>
+        <w:shd w:val="clear" w:color="auto" w:fill="FFFFFF"/>
+        <w:tabs>
+          <w:tab w:val="left" w:pos="916"/>
+          <w:tab w:val="left" w:pos="1832"/>
+          <w:tab w:val="left" w:pos="2748"/>
+          <w:tab w:val="left" w:pos="3664"/>
+          <w:tab w:val="left" w:pos="4580"/>
+          <w:tab w:val="left" w:pos="5496"/>
+          <w:tab w:val="left" w:pos="6412"/>
+          <w:tab w:val="left" w:pos="7328"/>
+          <w:tab w:val="left" w:pos="8244"/>
+          <w:tab w:val="left" w:pos="9160"/>
+          <w:tab w:val="left" w:pos="10076"/>
+          <w:tab w:val="left" w:pos="10992"/>
+          <w:tab w:val="left" w:pos="11908"/>
+          <w:tab w:val="left" w:pos="12824"/>
+          <w:tab w:val="left" w:pos="13740"/>
+          <w:tab w:val="left" w:pos="14656"/>
+        </w:tabs>
+        <w:wordWrap w:val="0"/>
+        <w:spacing w:after="0" w:line="330" w:lineRule="atLeast"/>
+        <w:rPr>
+          <w:rFonts w:ascii="Consolas" w:eastAsia="Times New Roman" w:hAnsi="Consolas" w:cs="Courier New"/>
+          <w:color w:val="0F1115"/>
+          <w:sz w:val="20"/>
+          <w:szCs w:val="20"/>
+          <w:lang w:val="en-GB" w:eastAsia="it-IT"/>
+        </w:rPr>
+      </w:pPr>
+      <w:r>
+        <w:rPr>
+          <w:rFonts w:ascii="Consolas" w:eastAsia="Times New Roman" w:hAnsi="Consolas" w:cs="Courier New"/>
+          <w:color w:val="0F1115"/>
+          <w:sz w:val="20"/>
+          <w:szCs w:val="20"/>
+          <w:lang w:val="en-GB" w:eastAsia="it-IT"/>
+        </w:rPr>
+        <w:t>C:\Windows\System32\ (per 64-bit)</w:t>
+      </w:r>
+    </w:p>
+    <w:p>
+      <w:pPr>
+        <w:shd w:val="clear" w:color="auto" w:fill="FFFFFF"/>
+        <w:tabs>
+          <w:tab w:val="left" w:pos="916"/>
+          <w:tab w:val="left" w:pos="1832"/>
+          <w:tab w:val="left" w:pos="2748"/>
+          <w:tab w:val="left" w:pos="3664"/>
+          <w:tab w:val="left" w:pos="4580"/>
+          <w:tab w:val="left" w:pos="5496"/>
+          <w:tab w:val="left" w:pos="6412"/>
+          <w:tab w:val="left" w:pos="7328"/>
+          <w:tab w:val="left" w:pos="8244"/>
+          <w:tab w:val="left" w:pos="9160"/>
+          <w:tab w:val="left" w:pos="10076"/>
+          <w:tab w:val="left" w:pos="10992"/>
+          <w:tab w:val="left" w:pos="11908"/>
+          <w:tab w:val="left" w:pos="12824"/>
+          <w:tab w:val="left" w:pos="13740"/>
+          <w:tab w:val="left" w:pos="14656"/>
+        </w:tabs>
+        <w:wordWrap w:val="0"/>
+        <w:spacing w:line="330" w:lineRule="atLeast"/>
+        <w:rPr>
+          <w:rFonts w:ascii="Consolas" w:eastAsia="Times New Roman" w:hAnsi="Consolas" w:cs="Courier New"/>
+          <w:color w:val="0F1115"/>
+          <w:sz w:val="20"/>
+          <w:szCs w:val="20"/>
+          <w:lang w:val="en-GB" w:eastAsia="it-IT"/>
+        </w:rPr>
+      </w:pPr>
+      <w:r>
+        <w:rPr>
+          <w:rFonts w:ascii="Consolas" w:eastAsia="Times New Roman" w:hAnsi="Consolas" w:cs="Courier New"/>
+          <w:color w:val="0F1115"/>
+          <w:sz w:val="20"/>
+          <w:szCs w:val="20"/>
+          <w:lang w:val="en-GB" w:eastAsia="it-IT"/>
+        </w:rPr>
+        <w:t>C:\Windows\SysWOW64\ (per 32-bit)</w:t>
+      </w:r>
+    </w:p>
+    <w:p>
+      <w:pPr>
+        <w:numPr>
+          <w:ilvl w:val="0"/>
+          <w:numId w:val="7"/>
+        </w:numPr>
+        <w:shd w:val="clear" w:color="auto" w:fill="FFFFFF"/>
+        <w:spacing w:before="100" w:beforeAutospacing="1" w:after="0" w:line="240" w:lineRule="auto"/>
+        <w:ind w:left="0"/>
+        <w:rPr>
+          <w:rFonts w:ascii="Segoe UI" w:eastAsia="Times New Roman" w:hAnsi="Segoe UI" w:cs="Segoe UI"/>
+          <w:color w:val="0F1115"/>
+          <w:sz w:val="24"/>
+          <w:szCs w:val="24"/>
+          <w:lang w:eastAsia="it-IT"/>
+        </w:rPr>
+      </w:pPr>
+      <w:r>
+        <w:rPr>
+          <w:rFonts w:ascii="Segoe UI" w:eastAsia="Times New Roman" w:hAnsi="Segoe UI" w:cs="Segoe UI"/>
+          <w:b/>
+          <w:bCs/>
+          <w:color w:val="0F1115"/>
+          <w:sz w:val="24"/>
+          <w:szCs w:val="24"/>
+          <w:lang w:eastAsia="it-IT"/>
+        </w:rPr>
+        <w:t>Copia questi file</w:t>
+      </w:r>
+      <w:r>
+        <w:rPr>
+          <w:rFonts w:ascii="Segoe UI" w:eastAsia="Times New Roman" w:hAnsi="Segoe UI" w:cs="Segoe UI"/>
+          <w:color w:val="0F1115"/>
+          <w:sz w:val="24"/>
+          <w:szCs w:val="24"/>
+          <w:lang w:eastAsia="it-IT"/>
+        </w:rPr>
+        <w:t xml:space="preserve"> nella stessa directory dell'eseguibile della tua </w:t>
+      </w:r>
+      <w:proofErr w:type="spellStart"/>
+      <w:r>
+        <w:rPr>
+          <w:rFonts w:ascii="Segoe UI" w:eastAsia="Times New Roman" w:hAnsi="Segoe UI" w:cs="Segoe UI"/>
+          <w:color w:val="0F1115"/>
+          <w:sz w:val="24"/>
+          <w:szCs w:val="24"/>
+          <w:lang w:eastAsia="it-IT"/>
+        </w:rPr>
+        <w:t>app</w:t>
+      </w:r>
+      <w:proofErr w:type="spellEnd"/>
+      <w:r>
+        <w:rPr>
+          <w:rFonts w:ascii="Segoe UI" w:eastAsia="Times New Roman" w:hAnsi="Segoe UI" w:cs="Segoe UI"/>
+          <w:color w:val="0F1115"/>
+          <w:sz w:val="24"/>
+          <w:szCs w:val="24"/>
+          <w:lang w:eastAsia="it-IT"/>
+        </w:rPr>
+        <w:t>.</w:t>
+      </w:r>
+    </w:p>
+    <w:p>
+      <w:pPr>
+        <w:shd w:val="clear" w:color="auto" w:fill="FFFFFF"/>
+        <w:spacing w:before="480" w:after="240" w:line="480" w:lineRule="atLeast"/>
+        <w:outlineLvl w:val="1"/>
+        <w:rPr>
+          <w:rFonts w:ascii="Segoe UI" w:eastAsia="Times New Roman" w:hAnsi="Segoe UI" w:cs="Segoe UI"/>
+          <w:b/>
+          <w:bCs/>
+          <w:color w:val="0F1115"/>
+          <w:sz w:val="33"/>
+          <w:szCs w:val="33"/>
+          <w:lang w:eastAsia="it-IT"/>
+        </w:rPr>
+      </w:pPr>
+      <w:r>
+        <w:rPr>
+          <w:rFonts w:ascii="Segoe UI" w:eastAsia="Times New Roman" w:hAnsi="Segoe UI" w:cs="Segoe UI"/>
+          <w:b/>
+          <w:bCs/>
+          <w:color w:val="0F1115"/>
+          <w:sz w:val="33"/>
+          <w:szCs w:val="33"/>
+          <w:lang w:eastAsia="it-IT"/>
+        </w:rPr>
+        <w:t xml:space="preserve">Soluzione 3: Modificare il progetto </w:t>
+      </w:r>
+      <w:proofErr w:type="spellStart"/>
+      <w:r>
+        <w:rPr>
+          <w:rFonts w:ascii="Segoe UI" w:eastAsia="Times New Roman" w:hAnsi="Segoe UI" w:cs="Segoe UI"/>
+          <w:b/>
+          <w:bCs/>
+          <w:color w:val="0F1115"/>
+          <w:sz w:val="33"/>
+          <w:szCs w:val="33"/>
+          <w:lang w:eastAsia="it-IT"/>
+        </w:rPr>
+        <w:t>Android</w:t>
+      </w:r>
+      <w:proofErr w:type="spellEnd"/>
+      <w:r>
+        <w:rPr>
+          <w:rFonts w:ascii="Segoe UI" w:eastAsia="Times New Roman" w:hAnsi="Segoe UI" w:cs="Segoe UI"/>
+          <w:b/>
+          <w:bCs/>
+          <w:color w:val="0F1115"/>
+          <w:sz w:val="33"/>
+          <w:szCs w:val="33"/>
+          <w:lang w:eastAsia="it-IT"/>
+        </w:rPr>
+        <w:t xml:space="preserve"> Studio</w:t>
+      </w:r>
+    </w:p>
+    <w:p>
+      <w:pPr>
+        <w:shd w:val="clear" w:color="auto" w:fill="FFFFFF"/>
+        <w:spacing w:before="240" w:after="240" w:line="240" w:lineRule="auto"/>
+        <w:rPr>
+          <w:rFonts w:ascii="Segoe UI" w:eastAsia="Times New Roman" w:hAnsi="Segoe UI" w:cs="Segoe UI"/>
+          <w:color w:val="0F1115"/>
+          <w:sz w:val="24"/>
+          <w:szCs w:val="24"/>
+          <w:lang w:eastAsia="it-IT"/>
+        </w:rPr>
+      </w:pPr>
+      <w:r>
+        <w:rPr>
+          <w:rFonts w:ascii="Segoe UI" w:eastAsia="Times New Roman" w:hAnsi="Segoe UI" w:cs="Segoe UI"/>
+          <w:color w:val="0F1115"/>
+          <w:sz w:val="24"/>
+          <w:szCs w:val="24"/>
+          <w:lang w:eastAsia="it-IT"/>
+        </w:rPr>
+        <w:lastRenderedPageBreak/>
+        <w:t>Se stai usando </w:t>
+      </w:r>
+      <w:r>
+        <w:rPr>
+          <w:rFonts w:ascii="Segoe UI" w:eastAsia="Times New Roman" w:hAnsi="Segoe UI" w:cs="Segoe UI"/>
+          <w:b/>
+          <w:bCs/>
+          <w:color w:val="0F1115"/>
+          <w:sz w:val="24"/>
+          <w:szCs w:val="24"/>
+          <w:lang w:eastAsia="it-IT"/>
+        </w:rPr>
+        <w:t>Java Native Interface (JNI)</w:t>
+      </w:r>
+      <w:r>
+        <w:rPr>
+          <w:rFonts w:ascii="Segoe UI" w:eastAsia="Times New Roman" w:hAnsi="Segoe UI" w:cs="Segoe UI"/>
+          <w:color w:val="0F1115"/>
+          <w:sz w:val="24"/>
+          <w:szCs w:val="24"/>
+          <w:lang w:eastAsia="it-IT"/>
+        </w:rPr>
+        <w:t> o librerie native:</w:t>
+      </w:r>
+    </w:p>
+    <w:p>
+      <w:pPr>
+        <w:numPr>
+          <w:ilvl w:val="0"/>
+          <w:numId w:val="8"/>
+        </w:numPr>
+        <w:shd w:val="clear" w:color="auto" w:fill="FFFFFF"/>
+        <w:spacing w:before="100" w:beforeAutospacing="1" w:after="120" w:line="240" w:lineRule="auto"/>
+        <w:ind w:left="0"/>
+        <w:rPr>
+          <w:rFonts w:ascii="Segoe UI" w:eastAsia="Times New Roman" w:hAnsi="Segoe UI" w:cs="Segoe UI"/>
+          <w:color w:val="0F1115"/>
+          <w:sz w:val="24"/>
+          <w:szCs w:val="24"/>
+          <w:lang w:eastAsia="it-IT"/>
+        </w:rPr>
+      </w:pPr>
+      <w:r>
+        <w:rPr>
+          <w:rFonts w:ascii="Segoe UI" w:eastAsia="Times New Roman" w:hAnsi="Segoe UI" w:cs="Segoe UI"/>
+          <w:b/>
+          <w:bCs/>
+          <w:color w:val="0F1115"/>
+          <w:sz w:val="24"/>
+          <w:szCs w:val="24"/>
+          <w:lang w:eastAsia="it-IT"/>
+        </w:rPr>
+        <w:t>Aggiungi i DLL al tuo progetto</w:t>
+      </w:r>
+      <w:r>
+        <w:rPr>
+          <w:rFonts w:ascii="Segoe UI" w:eastAsia="Times New Roman" w:hAnsi="Segoe UI" w:cs="Segoe UI"/>
+          <w:color w:val="0F1115"/>
+          <w:sz w:val="24"/>
+          <w:szCs w:val="24"/>
+          <w:lang w:eastAsia="it-IT"/>
+        </w:rPr>
+        <w:t>:</w:t>
+      </w:r>
+    </w:p>
+    <w:p>
+      <w:pPr>
+        <w:numPr>
+          <w:ilvl w:val="1"/>
+          <w:numId w:val="8"/>
+        </w:numPr>
+        <w:shd w:val="clear" w:color="auto" w:fill="FFFFFF"/>
+        <w:spacing w:before="100" w:beforeAutospacing="1" w:after="0" w:line="240" w:lineRule="auto"/>
+        <w:ind w:left="0"/>
+        <w:rPr>
+          <w:rFonts w:ascii="Segoe UI" w:eastAsia="Times New Roman" w:hAnsi="Segoe UI" w:cs="Segoe UI"/>
+          <w:color w:val="0F1115"/>
+          <w:sz w:val="24"/>
+          <w:szCs w:val="24"/>
+          <w:lang w:eastAsia="it-IT"/>
+        </w:rPr>
+      </w:pPr>
+      <w:r>
+        <w:rPr>
+          <w:rFonts w:ascii="Segoe UI" w:eastAsia="Times New Roman" w:hAnsi="Segoe UI" w:cs="Segoe UI"/>
+          <w:color w:val="0F1115"/>
+          <w:sz w:val="24"/>
+          <w:szCs w:val="24"/>
+          <w:lang w:eastAsia="it-IT"/>
+        </w:rPr>
+        <w:t>Crea una cartella </w:t>
+      </w:r>
+      <w:proofErr w:type="spellStart"/>
+      <w:r>
+        <w:rPr>
+          <w:rFonts w:ascii="Consolas" w:eastAsia="Times New Roman" w:hAnsi="Consolas" w:cs="Courier New"/>
+          <w:color w:val="0F1115"/>
+          <w:sz w:val="20"/>
+          <w:szCs w:val="20"/>
+          <w:shd w:val="clear" w:color="auto" w:fill="EBEEF2"/>
+          <w:lang w:eastAsia="it-IT"/>
+        </w:rPr>
+        <w:t>jniLibs</w:t>
+      </w:r>
+      <w:proofErr w:type="spellEnd"/>
+      <w:r>
+        <w:rPr>
+          <w:rFonts w:ascii="Segoe UI" w:eastAsia="Times New Roman" w:hAnsi="Segoe UI" w:cs="Segoe UI"/>
+          <w:color w:val="0F1115"/>
+          <w:sz w:val="24"/>
+          <w:szCs w:val="24"/>
+          <w:lang w:eastAsia="it-IT"/>
+        </w:rPr>
+        <w:t> in </w:t>
+      </w:r>
+      <w:proofErr w:type="spellStart"/>
+      <w:r>
+        <w:rPr>
+          <w:rFonts w:ascii="Consolas" w:eastAsia="Times New Roman" w:hAnsi="Consolas" w:cs="Courier New"/>
+          <w:color w:val="0F1115"/>
+          <w:sz w:val="20"/>
+          <w:szCs w:val="20"/>
+          <w:shd w:val="clear" w:color="auto" w:fill="EBEEF2"/>
+          <w:lang w:eastAsia="it-IT"/>
+        </w:rPr>
+        <w:t>app</w:t>
+      </w:r>
+      <w:proofErr w:type="spellEnd"/>
+      <w:r>
+        <w:rPr>
+          <w:rFonts w:ascii="Consolas" w:eastAsia="Times New Roman" w:hAnsi="Consolas" w:cs="Courier New"/>
+          <w:color w:val="0F1115"/>
+          <w:sz w:val="20"/>
+          <w:szCs w:val="20"/>
+          <w:shd w:val="clear" w:color="auto" w:fill="EBEEF2"/>
+          <w:lang w:eastAsia="it-IT"/>
+        </w:rPr>
+        <w:t>/</w:t>
+      </w:r>
+      <w:proofErr w:type="spellStart"/>
+      <w:r>
+        <w:rPr>
+          <w:rFonts w:ascii="Consolas" w:eastAsia="Times New Roman" w:hAnsi="Consolas" w:cs="Courier New"/>
+          <w:color w:val="0F1115"/>
+          <w:sz w:val="20"/>
+          <w:szCs w:val="20"/>
+          <w:shd w:val="clear" w:color="auto" w:fill="EBEEF2"/>
+          <w:lang w:eastAsia="it-IT"/>
+        </w:rPr>
+        <w:t>src</w:t>
+      </w:r>
+      <w:proofErr w:type="spellEnd"/>
+      <w:r>
+        <w:rPr>
+          <w:rFonts w:ascii="Consolas" w:eastAsia="Times New Roman" w:hAnsi="Consolas" w:cs="Courier New"/>
+          <w:color w:val="0F1115"/>
+          <w:sz w:val="20"/>
+          <w:szCs w:val="20"/>
+          <w:shd w:val="clear" w:color="auto" w:fill="EBEEF2"/>
+          <w:lang w:eastAsia="it-IT"/>
+        </w:rPr>
+        <w:t>/</w:t>
+      </w:r>
+      <w:proofErr w:type="spellStart"/>
+      <w:r>
+        <w:rPr>
+          <w:rFonts w:ascii="Consolas" w:eastAsia="Times New Roman" w:hAnsi="Consolas" w:cs="Courier New"/>
+          <w:color w:val="0F1115"/>
+          <w:sz w:val="20"/>
+          <w:szCs w:val="20"/>
+          <w:shd w:val="clear" w:color="auto" w:fill="EBEEF2"/>
+          <w:lang w:eastAsia="it-IT"/>
+        </w:rPr>
+        <w:t>main</w:t>
+      </w:r>
+      <w:proofErr w:type="spellEnd"/>
+      <w:r>
+        <w:rPr>
+          <w:rFonts w:ascii="Consolas" w:eastAsia="Times New Roman" w:hAnsi="Consolas" w:cs="Courier New"/>
+          <w:color w:val="0F1115"/>
+          <w:sz w:val="20"/>
+          <w:szCs w:val="20"/>
+          <w:shd w:val="clear" w:color="auto" w:fill="EBEEF2"/>
+          <w:lang w:eastAsia="it-IT"/>
+        </w:rPr>
+        <w:t>/</w:t>
+      </w:r>
+    </w:p>
+    <w:p>
+      <w:pPr>
+        <w:numPr>
+          <w:ilvl w:val="1"/>
+          <w:numId w:val="8"/>
+        </w:numPr>
+        <w:shd w:val="clear" w:color="auto" w:fill="FFFFFF"/>
+        <w:spacing w:before="100" w:beforeAutospacing="1" w:after="0" w:line="240" w:lineRule="auto"/>
+        <w:ind w:left="0"/>
+        <w:rPr>
+          <w:rFonts w:ascii="Segoe UI" w:eastAsia="Times New Roman" w:hAnsi="Segoe UI" w:cs="Segoe UI"/>
+          <w:color w:val="0F1115"/>
+          <w:sz w:val="24"/>
+          <w:szCs w:val="24"/>
+          <w:lang w:val="en-GB" w:eastAsia="it-IT"/>
+        </w:rPr>
+      </w:pPr>
+      <w:proofErr w:type="spellStart"/>
+      <w:r>
+        <w:rPr>
+          <w:rFonts w:ascii="Segoe UI" w:eastAsia="Times New Roman" w:hAnsi="Segoe UI" w:cs="Segoe UI"/>
+          <w:color w:val="0F1115"/>
+          <w:sz w:val="24"/>
+          <w:szCs w:val="24"/>
+          <w:lang w:val="en-GB" w:eastAsia="it-IT"/>
+        </w:rPr>
+        <w:t>Organizza</w:t>
+      </w:r>
+      <w:proofErr w:type="spellEnd"/>
+      <w:r>
+        <w:rPr>
+          <w:rFonts w:ascii="Segoe UI" w:eastAsia="Times New Roman" w:hAnsi="Segoe UI" w:cs="Segoe UI"/>
+          <w:color w:val="0F1115"/>
+          <w:sz w:val="24"/>
+          <w:szCs w:val="24"/>
+          <w:lang w:val="en-GB" w:eastAsia="it-IT"/>
+        </w:rPr>
+        <w:t>: </w:t>
+      </w:r>
+      <w:r>
+        <w:rPr>
+          <w:rFonts w:ascii="Consolas" w:eastAsia="Times New Roman" w:hAnsi="Consolas" w:cs="Courier New"/>
+          <w:color w:val="0F1115"/>
+          <w:sz w:val="20"/>
+          <w:szCs w:val="20"/>
+          <w:shd w:val="clear" w:color="auto" w:fill="EBEEF2"/>
+          <w:lang w:val="en-GB" w:eastAsia="it-IT"/>
+        </w:rPr>
+        <w:t>app/</w:t>
+      </w:r>
+      <w:proofErr w:type="spellStart"/>
+      <w:r>
+        <w:rPr>
+          <w:rFonts w:ascii="Consolas" w:eastAsia="Times New Roman" w:hAnsi="Consolas" w:cs="Courier New"/>
+          <w:color w:val="0F1115"/>
+          <w:sz w:val="20"/>
+          <w:szCs w:val="20"/>
+          <w:shd w:val="clear" w:color="auto" w:fill="EBEEF2"/>
+          <w:lang w:val="en-GB" w:eastAsia="it-IT"/>
+        </w:rPr>
+        <w:t>src</w:t>
+      </w:r>
+      <w:proofErr w:type="spellEnd"/>
+      <w:r>
+        <w:rPr>
+          <w:rFonts w:ascii="Consolas" w:eastAsia="Times New Roman" w:hAnsi="Consolas" w:cs="Courier New"/>
+          <w:color w:val="0F1115"/>
+          <w:sz w:val="20"/>
+          <w:szCs w:val="20"/>
+          <w:shd w:val="clear" w:color="auto" w:fill="EBEEF2"/>
+          <w:lang w:val="en-GB" w:eastAsia="it-IT"/>
+        </w:rPr>
+        <w:t>/main/</w:t>
+      </w:r>
+      <w:proofErr w:type="spellStart"/>
+      <w:r>
+        <w:rPr>
+          <w:rFonts w:ascii="Consolas" w:eastAsia="Times New Roman" w:hAnsi="Consolas" w:cs="Courier New"/>
+          <w:color w:val="0F1115"/>
+          <w:sz w:val="20"/>
+          <w:szCs w:val="20"/>
+          <w:shd w:val="clear" w:color="auto" w:fill="EBEEF2"/>
+          <w:lang w:val="en-GB" w:eastAsia="it-IT"/>
+        </w:rPr>
+        <w:t>jniLibs</w:t>
+      </w:r>
+      <w:proofErr w:type="spellEnd"/>
+      <w:r>
+        <w:rPr>
+          <w:rFonts w:ascii="Consolas" w:eastAsia="Times New Roman" w:hAnsi="Consolas" w:cs="Courier New"/>
+          <w:color w:val="0F1115"/>
+          <w:sz w:val="20"/>
+          <w:szCs w:val="20"/>
+          <w:shd w:val="clear" w:color="auto" w:fill="EBEEF2"/>
+          <w:lang w:val="en-GB" w:eastAsia="it-IT"/>
+        </w:rPr>
+        <w:t>/windows/</w:t>
+      </w:r>
+    </w:p>
+    <w:p>
+      <w:pPr>
+        <w:numPr>
+          <w:ilvl w:val="1"/>
+          <w:numId w:val="8"/>
+        </w:numPr>
+        <w:shd w:val="clear" w:color="auto" w:fill="FFFFFF"/>
+        <w:spacing w:before="100" w:beforeAutospacing="1" w:after="0" w:line="240" w:lineRule="auto"/>
+        <w:ind w:left="0"/>
+        <w:rPr>
+          <w:rFonts w:ascii="Segoe UI" w:eastAsia="Times New Roman" w:hAnsi="Segoe UI" w:cs="Segoe UI"/>
+          <w:color w:val="0F1115"/>
+          <w:sz w:val="24"/>
+          <w:szCs w:val="24"/>
+          <w:lang w:eastAsia="it-IT"/>
+        </w:rPr>
+      </w:pPr>
+      <w:r>
+        <w:rPr>
+          <w:rFonts w:ascii="Segoe UI" w:eastAsia="Times New Roman" w:hAnsi="Segoe UI" w:cs="Segoe UI"/>
+          <w:color w:val="0F1115"/>
+          <w:sz w:val="24"/>
+          <w:szCs w:val="24"/>
+          <w:lang w:eastAsia="it-IT"/>
+        </w:rPr>
+        <w:t>Copia i DLL qui</w:t>
+      </w:r>
+    </w:p>
+    <w:p>
+      <w:pPr>
+        <w:numPr>
+          <w:ilvl w:val="0"/>
+          <w:numId w:val="8"/>
+        </w:numPr>
+        <w:shd w:val="clear" w:color="auto" w:fill="FFFFFF"/>
+        <w:spacing w:before="100" w:beforeAutospacing="1" w:after="120" w:line="240" w:lineRule="auto"/>
+        <w:ind w:left="0"/>
+        <w:rPr>
+          <w:rFonts w:ascii="Segoe UI" w:eastAsia="Times New Roman" w:hAnsi="Segoe UI" w:cs="Segoe UI"/>
+          <w:color w:val="0F1115"/>
+          <w:sz w:val="24"/>
+          <w:szCs w:val="24"/>
+          <w:lang w:eastAsia="it-IT"/>
+        </w:rPr>
+      </w:pPr>
+      <w:r>
+        <w:rPr>
+          <w:rFonts w:ascii="Segoe UI" w:eastAsia="Times New Roman" w:hAnsi="Segoe UI" w:cs="Segoe UI"/>
+          <w:b/>
+          <w:bCs/>
+          <w:color w:val="0F1115"/>
+          <w:sz w:val="24"/>
+          <w:szCs w:val="24"/>
+          <w:lang w:eastAsia="it-IT"/>
+        </w:rPr>
+        <w:t>Modifica </w:t>
+      </w:r>
+      <w:proofErr w:type="spellStart"/>
+      <w:proofErr w:type="gramStart"/>
+      <w:r>
+        <w:rPr>
+          <w:rFonts w:ascii="Consolas" w:eastAsia="Times New Roman" w:hAnsi="Consolas" w:cs="Courier New"/>
+          <w:color w:val="0F1115"/>
+          <w:sz w:val="20"/>
+          <w:szCs w:val="20"/>
+          <w:shd w:val="clear" w:color="auto" w:fill="EBEEF2"/>
+          <w:lang w:eastAsia="it-IT"/>
+        </w:rPr>
+        <w:t>build.gradle</w:t>
+      </w:r>
+      <w:proofErr w:type="spellEnd"/>
+      <w:proofErr w:type="gramEnd"/>
+      <w:r>
+        <w:rPr>
+          <w:rFonts w:ascii="Segoe UI" w:eastAsia="Times New Roman" w:hAnsi="Segoe UI" w:cs="Segoe UI"/>
+          <w:color w:val="0F1115"/>
+          <w:sz w:val="24"/>
+          <w:szCs w:val="24"/>
+          <w:lang w:eastAsia="it-IT"/>
+        </w:rPr>
+        <w:t> (</w:t>
+      </w:r>
+      <w:proofErr w:type="spellStart"/>
+      <w:r>
+        <w:rPr>
+          <w:rFonts w:ascii="Segoe UI" w:eastAsia="Times New Roman" w:hAnsi="Segoe UI" w:cs="Segoe UI"/>
+          <w:color w:val="0F1115"/>
+          <w:sz w:val="24"/>
+          <w:szCs w:val="24"/>
+          <w:lang w:eastAsia="it-IT"/>
+        </w:rPr>
+        <w:t>module</w:t>
+      </w:r>
+      <w:proofErr w:type="spellEnd"/>
+      <w:r>
+        <w:rPr>
+          <w:rFonts w:ascii="Segoe UI" w:eastAsia="Times New Roman" w:hAnsi="Segoe UI" w:cs="Segoe UI"/>
+          <w:color w:val="0F1115"/>
+          <w:sz w:val="24"/>
+          <w:szCs w:val="24"/>
+          <w:lang w:eastAsia="it-IT"/>
+        </w:rPr>
+        <w:t>):</w:t>
+      </w:r>
+    </w:p>
+    <w:p>
+      <w:pPr>
+        <w:shd w:val="clear" w:color="auto" w:fill="FFFFFF"/>
+        <w:spacing w:after="0" w:afterAutospacing="1" w:line="189" w:lineRule="atLeast"/>
+        <w:rPr>
+          <w:rFonts w:ascii="Segoe UI" w:eastAsia="Times New Roman" w:hAnsi="Segoe UI" w:cs="Segoe UI"/>
+          <w:color w:val="0F1115"/>
+          <w:sz w:val="19"/>
+          <w:szCs w:val="19"/>
+          <w:lang w:eastAsia="it-IT"/>
+        </w:rPr>
+      </w:pPr>
+      <w:proofErr w:type="spellStart"/>
+      <w:r>
+        <w:rPr>
+          <w:rFonts w:ascii="Consolas" w:eastAsia="Times New Roman" w:hAnsi="Consolas" w:cs="Segoe UI"/>
+          <w:color w:val="0F1115"/>
+          <w:sz w:val="18"/>
+          <w:szCs w:val="18"/>
+          <w:lang w:eastAsia="it-IT"/>
+        </w:rPr>
+        <w:t>gradle</w:t>
+      </w:r>
+      <w:proofErr w:type="spellEnd"/>
+    </w:p>
+    <w:p>
+      <w:pPr>
+        <w:shd w:val="clear" w:color="auto" w:fill="FFFFFF"/>
+        <w:tabs>
+          <w:tab w:val="left" w:pos="916"/>
+          <w:tab w:val="left" w:pos="1832"/>
+          <w:tab w:val="left" w:pos="2748"/>
+          <w:tab w:val="left" w:pos="3664"/>
+          <w:tab w:val="left" w:pos="4580"/>
+          <w:tab w:val="left" w:pos="5496"/>
+          <w:tab w:val="left" w:pos="6412"/>
+          <w:tab w:val="left" w:pos="7328"/>
+          <w:tab w:val="left" w:pos="8244"/>
+          <w:tab w:val="left" w:pos="9160"/>
+          <w:tab w:val="left" w:pos="10076"/>
+          <w:tab w:val="left" w:pos="10992"/>
+          <w:tab w:val="left" w:pos="11908"/>
+          <w:tab w:val="left" w:pos="12824"/>
+          <w:tab w:val="left" w:pos="13740"/>
+          <w:tab w:val="left" w:pos="14656"/>
+        </w:tabs>
+        <w:wordWrap w:val="0"/>
+        <w:spacing w:after="0" w:line="330" w:lineRule="atLeast"/>
+        <w:rPr>
+          <w:rFonts w:ascii="Consolas" w:eastAsia="Times New Roman" w:hAnsi="Consolas" w:cs="Courier New"/>
+          <w:color w:val="0F1115"/>
+          <w:sz w:val="20"/>
+          <w:szCs w:val="20"/>
+          <w:lang w:eastAsia="it-IT"/>
+        </w:rPr>
+      </w:pPr>
+      <w:proofErr w:type="spellStart"/>
+      <w:r>
+        <w:rPr>
+          <w:rFonts w:ascii="Consolas" w:eastAsia="Times New Roman" w:hAnsi="Consolas" w:cs="Courier New"/>
+          <w:color w:val="0F1115"/>
+          <w:sz w:val="20"/>
+          <w:szCs w:val="20"/>
+          <w:lang w:eastAsia="it-IT"/>
+        </w:rPr>
+        <w:t>android</w:t>
+      </w:r>
+      <w:proofErr w:type="spellEnd"/>
+      <w:r>
+        <w:rPr>
+          <w:rFonts w:ascii="Consolas" w:eastAsia="Times New Roman" w:hAnsi="Consolas" w:cs="Courier New"/>
+          <w:color w:val="0F1115"/>
+          <w:sz w:val="20"/>
+          <w:szCs w:val="20"/>
+          <w:lang w:eastAsia="it-IT"/>
+        </w:rPr>
+        <w:t xml:space="preserve"> </w:t>
+      </w:r>
+      <w:r>
+        <w:rPr>
+          <w:rFonts w:ascii="Consolas" w:eastAsia="Times New Roman" w:hAnsi="Consolas" w:cs="Courier New"/>
+          <w:color w:val="383A42"/>
+          <w:sz w:val="20"/>
+          <w:szCs w:val="20"/>
+          <w:lang w:eastAsia="it-IT"/>
+        </w:rPr>
+        <w:t>{</w:t>
+      </w:r>
+    </w:p>
+    <w:p>
+      <w:pPr>
+        <w:shd w:val="clear" w:color="auto" w:fill="FFFFFF"/>
+        <w:tabs>
+          <w:tab w:val="left" w:pos="916"/>
+          <w:tab w:val="left" w:pos="1832"/>
+          <w:tab w:val="left" w:pos="2748"/>
+          <w:tab w:val="left" w:pos="3664"/>
+          <w:tab w:val="left" w:pos="4580"/>
+          <w:tab w:val="left" w:pos="5496"/>
+          <w:tab w:val="left" w:pos="6412"/>
+          <w:tab w:val="left" w:pos="7328"/>
+          <w:tab w:val="left" w:pos="8244"/>
+          <w:tab w:val="left" w:pos="9160"/>
+          <w:tab w:val="left" w:pos="10076"/>
+          <w:tab w:val="left" w:pos="10992"/>
+          <w:tab w:val="left" w:pos="11908"/>
+          <w:tab w:val="left" w:pos="12824"/>
+          <w:tab w:val="left" w:pos="13740"/>
+          <w:tab w:val="left" w:pos="14656"/>
+        </w:tabs>
+        <w:wordWrap w:val="0"/>
+        <w:spacing w:after="0" w:line="330" w:lineRule="atLeast"/>
+        <w:rPr>
+          <w:rFonts w:ascii="Consolas" w:eastAsia="Times New Roman" w:hAnsi="Consolas" w:cs="Courier New"/>
+          <w:color w:val="0F1115"/>
+          <w:sz w:val="20"/>
+          <w:szCs w:val="20"/>
+          <w:lang w:eastAsia="it-IT"/>
+        </w:rPr>
+      </w:pPr>
+      <w:r>
+        <w:rPr>
+          <w:rFonts w:ascii="Consolas" w:eastAsia="Times New Roman" w:hAnsi="Consolas" w:cs="Courier New"/>
+          <w:color w:val="0F1115"/>
+          <w:sz w:val="20"/>
+          <w:szCs w:val="20"/>
+          <w:lang w:eastAsia="it-IT"/>
+        </w:rPr>
+        <w:t xml:space="preserve">    </w:t>
+      </w:r>
+      <w:proofErr w:type="spellStart"/>
+      <w:r>
+        <w:rPr>
+          <w:rFonts w:ascii="Consolas" w:eastAsia="Times New Roman" w:hAnsi="Consolas" w:cs="Courier New"/>
+          <w:color w:val="A626A4"/>
+          <w:sz w:val="20"/>
+          <w:szCs w:val="20"/>
+          <w:lang w:eastAsia="it-IT"/>
+        </w:rPr>
+        <w:t>sourceSets</w:t>
+      </w:r>
+      <w:proofErr w:type="spellEnd"/>
+      <w:r>
+        <w:rPr>
+          <w:rFonts w:ascii="Consolas" w:eastAsia="Times New Roman" w:hAnsi="Consolas" w:cs="Courier New"/>
+          <w:color w:val="0F1115"/>
+          <w:sz w:val="20"/>
+          <w:szCs w:val="20"/>
+          <w:lang w:eastAsia="it-IT"/>
+        </w:rPr>
+        <w:t xml:space="preserve"> </w:t>
+      </w:r>
+      <w:r>
+        <w:rPr>
+          <w:rFonts w:ascii="Consolas" w:eastAsia="Times New Roman" w:hAnsi="Consolas" w:cs="Courier New"/>
+          <w:color w:val="383A42"/>
+          <w:sz w:val="20"/>
+          <w:szCs w:val="20"/>
+          <w:lang w:eastAsia="it-IT"/>
+        </w:rPr>
+        <w:t>{</w:t>
+      </w:r>
+    </w:p>
+    <w:p>
+      <w:pPr>
+        <w:shd w:val="clear" w:color="auto" w:fill="FFFFFF"/>
+        <w:tabs>
+          <w:tab w:val="left" w:pos="916"/>
+          <w:tab w:val="left" w:pos="1832"/>
+          <w:tab w:val="left" w:pos="2748"/>
+          <w:tab w:val="left" w:pos="3664"/>
+          <w:tab w:val="left" w:pos="4580"/>
+          <w:tab w:val="left" w:pos="5496"/>
+          <w:tab w:val="left" w:pos="6412"/>
+          <w:tab w:val="left" w:pos="7328"/>
+          <w:tab w:val="left" w:pos="8244"/>
+          <w:tab w:val="left" w:pos="9160"/>
+          <w:tab w:val="left" w:pos="10076"/>
+          <w:tab w:val="left" w:pos="10992"/>
+          <w:tab w:val="left" w:pos="11908"/>
+          <w:tab w:val="left" w:pos="12824"/>
+          <w:tab w:val="left" w:pos="13740"/>
+          <w:tab w:val="left" w:pos="14656"/>
+        </w:tabs>
+        <w:wordWrap w:val="0"/>
+        <w:spacing w:after="0" w:line="330" w:lineRule="atLeast"/>
+        <w:rPr>
+          <w:rFonts w:ascii="Consolas" w:eastAsia="Times New Roman" w:hAnsi="Consolas" w:cs="Courier New"/>
+          <w:color w:val="0F1115"/>
+          <w:sz w:val="20"/>
+          <w:szCs w:val="20"/>
+          <w:lang w:eastAsia="it-IT"/>
+        </w:rPr>
+      </w:pPr>
+      <w:r>
+        <w:rPr>
+          <w:rFonts w:ascii="Consolas" w:eastAsia="Times New Roman" w:hAnsi="Consolas" w:cs="Courier New"/>
+          <w:color w:val="0F1115"/>
+          <w:sz w:val="20"/>
+          <w:szCs w:val="20"/>
+          <w:lang w:eastAsia="it-IT"/>
+        </w:rPr>
+        <w:t xml:space="preserve">        </w:t>
+      </w:r>
+      <w:proofErr w:type="spellStart"/>
+      <w:r>
+        <w:rPr>
+          <w:rFonts w:ascii="Consolas" w:eastAsia="Times New Roman" w:hAnsi="Consolas" w:cs="Courier New"/>
+          <w:color w:val="0F1115"/>
+          <w:sz w:val="20"/>
+          <w:szCs w:val="20"/>
+          <w:lang w:eastAsia="it-IT"/>
+        </w:rPr>
+        <w:t>main</w:t>
+      </w:r>
+      <w:proofErr w:type="spellEnd"/>
+      <w:r>
+        <w:rPr>
+          <w:rFonts w:ascii="Consolas" w:eastAsia="Times New Roman" w:hAnsi="Consolas" w:cs="Courier New"/>
+          <w:color w:val="0F1115"/>
+          <w:sz w:val="20"/>
+          <w:szCs w:val="20"/>
+          <w:lang w:eastAsia="it-IT"/>
+        </w:rPr>
+        <w:t xml:space="preserve"> </w:t>
+      </w:r>
+      <w:r>
+        <w:rPr>
+          <w:rFonts w:ascii="Consolas" w:eastAsia="Times New Roman" w:hAnsi="Consolas" w:cs="Courier New"/>
+          <w:color w:val="383A42"/>
+          <w:sz w:val="20"/>
+          <w:szCs w:val="20"/>
+          <w:lang w:eastAsia="it-IT"/>
+        </w:rPr>
+        <w:t>{</w:t>
+      </w:r>
+    </w:p>
+    <w:p>
+      <w:pPr>
+        <w:shd w:val="clear" w:color="auto" w:fill="FFFFFF"/>
+        <w:tabs>
+          <w:tab w:val="left" w:pos="916"/>
+          <w:tab w:val="left" w:pos="1832"/>
+          <w:tab w:val="left" w:pos="2748"/>
+          <w:tab w:val="left" w:pos="3664"/>
+          <w:tab w:val="left" w:pos="4580"/>
+          <w:tab w:val="left" w:pos="5496"/>
+          <w:tab w:val="left" w:pos="6412"/>
+          <w:tab w:val="left" w:pos="7328"/>
+          <w:tab w:val="left" w:pos="8244"/>
+          <w:tab w:val="left" w:pos="9160"/>
+          <w:tab w:val="left" w:pos="10076"/>
+          <w:tab w:val="left" w:pos="10992"/>
+          <w:tab w:val="left" w:pos="11908"/>
+          <w:tab w:val="left" w:pos="12824"/>
+          <w:tab w:val="left" w:pos="13740"/>
+          <w:tab w:val="left" w:pos="14656"/>
+        </w:tabs>
+        <w:wordWrap w:val="0"/>
+        <w:spacing w:after="0" w:line="330" w:lineRule="atLeast"/>
+        <w:rPr>
+          <w:rFonts w:ascii="Consolas" w:eastAsia="Times New Roman" w:hAnsi="Consolas" w:cs="Courier New"/>
+          <w:color w:val="0F1115"/>
+          <w:sz w:val="20"/>
+          <w:szCs w:val="20"/>
+          <w:lang w:eastAsia="it-IT"/>
+        </w:rPr>
+      </w:pPr>
+      <w:r>
+        <w:rPr>
+          <w:rFonts w:ascii="Consolas" w:eastAsia="Times New Roman" w:hAnsi="Consolas" w:cs="Courier New"/>
+          <w:color w:val="0F1115"/>
+          <w:sz w:val="20"/>
+          <w:szCs w:val="20"/>
+          <w:lang w:eastAsia="it-IT"/>
+        </w:rPr>
+        <w:t xml:space="preserve">            </w:t>
+      </w:r>
+      <w:proofErr w:type="spellStart"/>
+      <w:r>
+        <w:rPr>
+          <w:rFonts w:ascii="Consolas" w:eastAsia="Times New Roman" w:hAnsi="Consolas" w:cs="Courier New"/>
+          <w:color w:val="0F1115"/>
+          <w:sz w:val="20"/>
+          <w:szCs w:val="20"/>
+          <w:lang w:eastAsia="it-IT"/>
+        </w:rPr>
+        <w:t>jniLibs</w:t>
+      </w:r>
+      <w:r>
+        <w:rPr>
+          <w:rFonts w:ascii="Consolas" w:eastAsia="Times New Roman" w:hAnsi="Consolas" w:cs="Courier New"/>
+          <w:color w:val="383A42"/>
+          <w:sz w:val="20"/>
+          <w:szCs w:val="20"/>
+          <w:lang w:eastAsia="it-IT"/>
+        </w:rPr>
+        <w:t>.</w:t>
+      </w:r>
+      <w:r>
+        <w:rPr>
+          <w:rFonts w:ascii="Consolas" w:eastAsia="Times New Roman" w:hAnsi="Consolas" w:cs="Courier New"/>
+          <w:color w:val="0F1115"/>
+          <w:sz w:val="20"/>
+          <w:szCs w:val="20"/>
+          <w:lang w:eastAsia="it-IT"/>
+        </w:rPr>
+        <w:t>srcDirs</w:t>
+      </w:r>
+      <w:proofErr w:type="spellEnd"/>
+      <w:r>
+        <w:rPr>
+          <w:rFonts w:ascii="Consolas" w:eastAsia="Times New Roman" w:hAnsi="Consolas" w:cs="Courier New"/>
+          <w:color w:val="0F1115"/>
+          <w:sz w:val="20"/>
+          <w:szCs w:val="20"/>
+          <w:lang w:eastAsia="it-IT"/>
+        </w:rPr>
+        <w:t xml:space="preserve"> </w:t>
+      </w:r>
+      <w:r>
+        <w:rPr>
+          <w:rFonts w:ascii="Consolas" w:eastAsia="Times New Roman" w:hAnsi="Consolas" w:cs="Courier New"/>
+          <w:color w:val="4078F2"/>
+          <w:sz w:val="20"/>
+          <w:szCs w:val="20"/>
+          <w:lang w:eastAsia="it-IT"/>
+        </w:rPr>
+        <w:t>=</w:t>
+      </w:r>
+      <w:r>
+        <w:rPr>
+          <w:rFonts w:ascii="Consolas" w:eastAsia="Times New Roman" w:hAnsi="Consolas" w:cs="Courier New"/>
+          <w:color w:val="0F1115"/>
+          <w:sz w:val="20"/>
+          <w:szCs w:val="20"/>
+          <w:lang w:eastAsia="it-IT"/>
+        </w:rPr>
+        <w:t xml:space="preserve"> </w:t>
+      </w:r>
+      <w:r>
+        <w:rPr>
+          <w:rFonts w:ascii="Consolas" w:eastAsia="Times New Roman" w:hAnsi="Consolas" w:cs="Courier New"/>
+          <w:color w:val="383A42"/>
+          <w:sz w:val="20"/>
+          <w:szCs w:val="20"/>
+          <w:lang w:eastAsia="it-IT"/>
+        </w:rPr>
+        <w:t>[</w:t>
+      </w:r>
+      <w:r>
+        <w:rPr>
+          <w:rFonts w:ascii="Consolas" w:eastAsia="Times New Roman" w:hAnsi="Consolas" w:cs="Courier New"/>
+          <w:color w:val="50A14F"/>
+          <w:sz w:val="20"/>
+          <w:szCs w:val="20"/>
+          <w:lang w:eastAsia="it-IT"/>
+        </w:rPr>
+        <w:t>'</w:t>
+      </w:r>
+      <w:proofErr w:type="spellStart"/>
+      <w:r>
+        <w:rPr>
+          <w:rFonts w:ascii="Consolas" w:eastAsia="Times New Roman" w:hAnsi="Consolas" w:cs="Courier New"/>
+          <w:color w:val="50A14F"/>
+          <w:sz w:val="20"/>
+          <w:szCs w:val="20"/>
+          <w:lang w:eastAsia="it-IT"/>
+        </w:rPr>
+        <w:t>src</w:t>
+      </w:r>
+      <w:proofErr w:type="spellEnd"/>
+      <w:r>
+        <w:rPr>
+          <w:rFonts w:ascii="Consolas" w:eastAsia="Times New Roman" w:hAnsi="Consolas" w:cs="Courier New"/>
+          <w:color w:val="50A14F"/>
+          <w:sz w:val="20"/>
+          <w:szCs w:val="20"/>
+          <w:lang w:eastAsia="it-IT"/>
+        </w:rPr>
+        <w:t>/</w:t>
+      </w:r>
+      <w:proofErr w:type="spellStart"/>
+      <w:r>
+        <w:rPr>
+          <w:rFonts w:ascii="Consolas" w:eastAsia="Times New Roman" w:hAnsi="Consolas" w:cs="Courier New"/>
+          <w:color w:val="50A14F"/>
+          <w:sz w:val="20"/>
+          <w:szCs w:val="20"/>
+          <w:lang w:eastAsia="it-IT"/>
+        </w:rPr>
+        <w:t>main</w:t>
+      </w:r>
+      <w:proofErr w:type="spellEnd"/>
+      <w:r>
+        <w:rPr>
+          <w:rFonts w:ascii="Consolas" w:eastAsia="Times New Roman" w:hAnsi="Consolas" w:cs="Courier New"/>
+          <w:color w:val="50A14F"/>
+          <w:sz w:val="20"/>
+          <w:szCs w:val="20"/>
+          <w:lang w:eastAsia="it-IT"/>
+        </w:rPr>
+        <w:t>/</w:t>
+      </w:r>
+      <w:proofErr w:type="spellStart"/>
+      <w:r>
+        <w:rPr>
+          <w:rFonts w:ascii="Consolas" w:eastAsia="Times New Roman" w:hAnsi="Consolas" w:cs="Courier New"/>
+          <w:color w:val="50A14F"/>
+          <w:sz w:val="20"/>
+          <w:szCs w:val="20"/>
+          <w:lang w:eastAsia="it-IT"/>
+        </w:rPr>
+        <w:t>jniLibs</w:t>
+      </w:r>
+      <w:proofErr w:type="spellEnd"/>
+      <w:r>
+        <w:rPr>
+          <w:rFonts w:ascii="Consolas" w:eastAsia="Times New Roman" w:hAnsi="Consolas" w:cs="Courier New"/>
+          <w:color w:val="50A14F"/>
+          <w:sz w:val="20"/>
+          <w:szCs w:val="20"/>
+          <w:lang w:eastAsia="it-IT"/>
+        </w:rPr>
+        <w:t>'</w:t>
+      </w:r>
+      <w:r>
+        <w:rPr>
+          <w:rFonts w:ascii="Consolas" w:eastAsia="Times New Roman" w:hAnsi="Consolas" w:cs="Courier New"/>
+          <w:color w:val="383A42"/>
+          <w:sz w:val="20"/>
+          <w:szCs w:val="20"/>
+          <w:lang w:eastAsia="it-IT"/>
+        </w:rPr>
+        <w:t>]</w:t>
+      </w:r>
+    </w:p>
+    <w:p>
+      <w:pPr>
+        <w:shd w:val="clear" w:color="auto" w:fill="FFFFFF"/>
+        <w:tabs>
+          <w:tab w:val="left" w:pos="916"/>
+          <w:tab w:val="left" w:pos="1832"/>
+          <w:tab w:val="left" w:pos="2748"/>
+          <w:tab w:val="left" w:pos="3664"/>
+          <w:tab w:val="left" w:pos="4580"/>
+          <w:tab w:val="left" w:pos="5496"/>
+          <w:tab w:val="left" w:pos="6412"/>
+          <w:tab w:val="left" w:pos="7328"/>
+          <w:tab w:val="left" w:pos="8244"/>
+          <w:tab w:val="left" w:pos="9160"/>
+          <w:tab w:val="left" w:pos="10076"/>
+          <w:tab w:val="left" w:pos="10992"/>
+          <w:tab w:val="left" w:pos="11908"/>
+          <w:tab w:val="left" w:pos="12824"/>
+          <w:tab w:val="left" w:pos="13740"/>
+          <w:tab w:val="left" w:pos="14656"/>
+        </w:tabs>
+        <w:wordWrap w:val="0"/>
+        <w:spacing w:after="0" w:line="330" w:lineRule="atLeast"/>
+        <w:rPr>
+          <w:rFonts w:ascii="Consolas" w:eastAsia="Times New Roman" w:hAnsi="Consolas" w:cs="Courier New"/>
+          <w:color w:val="0F1115"/>
+          <w:sz w:val="20"/>
+          <w:szCs w:val="20"/>
+          <w:lang w:eastAsia="it-IT"/>
+        </w:rPr>
+      </w:pPr>
+      <w:r>
+        <w:rPr>
+          <w:rFonts w:ascii="Consolas" w:eastAsia="Times New Roman" w:hAnsi="Consolas" w:cs="Courier New"/>
+          <w:color w:val="0F1115"/>
+          <w:sz w:val="20"/>
+          <w:szCs w:val="20"/>
+          <w:lang w:eastAsia="it-IT"/>
+        </w:rPr>
+        <w:t xml:space="preserve">        </w:t>
+      </w:r>
+      <w:r>
+        <w:rPr>
+          <w:rFonts w:ascii="Consolas" w:eastAsia="Times New Roman" w:hAnsi="Consolas" w:cs="Courier New"/>
+          <w:color w:val="383A42"/>
+          <w:sz w:val="20"/>
+          <w:szCs w:val="20"/>
+          <w:lang w:eastAsia="it-IT"/>
+        </w:rPr>
+        <w:t>}</w:t>
+      </w:r>
+    </w:p>
+    <w:p>
+      <w:pPr>
+        <w:shd w:val="clear" w:color="auto" w:fill="FFFFFF"/>
+        <w:tabs>
+          <w:tab w:val="left" w:pos="916"/>
+          <w:tab w:val="left" w:pos="1832"/>
+          <w:tab w:val="left" w:pos="2748"/>
+          <w:tab w:val="left" w:pos="3664"/>
+          <w:tab w:val="left" w:pos="4580"/>
+          <w:tab w:val="left" w:pos="5496"/>
+          <w:tab w:val="left" w:pos="6412"/>
+          <w:tab w:val="left" w:pos="7328"/>
+          <w:tab w:val="left" w:pos="8244"/>
+          <w:tab w:val="left" w:pos="9160"/>
+          <w:tab w:val="left" w:pos="10076"/>
+          <w:tab w:val="left" w:pos="10992"/>
+          <w:tab w:val="left" w:pos="11908"/>
+          <w:tab w:val="left" w:pos="12824"/>
+          <w:tab w:val="left" w:pos="13740"/>
+          <w:tab w:val="left" w:pos="14656"/>
+        </w:tabs>
+        <w:wordWrap w:val="0"/>
+        <w:spacing w:after="0" w:line="330" w:lineRule="atLeast"/>
+        <w:rPr>
+          <w:rFonts w:ascii="Consolas" w:eastAsia="Times New Roman" w:hAnsi="Consolas" w:cs="Courier New"/>
+          <w:color w:val="0F1115"/>
+          <w:sz w:val="20"/>
+          <w:szCs w:val="20"/>
+          <w:lang w:eastAsia="it-IT"/>
+        </w:rPr>
+      </w:pPr>
+      <w:r>
+        <w:rPr>
+          <w:rFonts w:ascii="Consolas" w:eastAsia="Times New Roman" w:hAnsi="Consolas" w:cs="Courier New"/>
+          <w:color w:val="0F1115"/>
+          <w:sz w:val="20"/>
+          <w:szCs w:val="20"/>
+          <w:lang w:eastAsia="it-IT"/>
+        </w:rPr>
+        <w:t xml:space="preserve">    </w:t>
+      </w:r>
+      <w:r>
+        <w:rPr>
+          <w:rFonts w:ascii="Consolas" w:eastAsia="Times New Roman" w:hAnsi="Consolas" w:cs="Courier New"/>
+          <w:color w:val="383A42"/>
+          <w:sz w:val="20"/>
+          <w:szCs w:val="20"/>
+          <w:lang w:eastAsia="it-IT"/>
+        </w:rPr>
+        <w:t>}</w:t>
+      </w:r>
+    </w:p>
+    <w:p>
+      <w:pPr>
+        <w:shd w:val="clear" w:color="auto" w:fill="FFFFFF"/>
+        <w:tabs>
+          <w:tab w:val="left" w:pos="916"/>
+          <w:tab w:val="left" w:pos="1832"/>
+          <w:tab w:val="left" w:pos="2748"/>
+          <w:tab w:val="left" w:pos="3664"/>
+          <w:tab w:val="left" w:pos="4580"/>
+          <w:tab w:val="left" w:pos="5496"/>
+          <w:tab w:val="left" w:pos="6412"/>
+          <w:tab w:val="left" w:pos="7328"/>
+          <w:tab w:val="left" w:pos="8244"/>
+          <w:tab w:val="left" w:pos="9160"/>
+          <w:tab w:val="left" w:pos="10076"/>
+          <w:tab w:val="left" w:pos="10992"/>
+          <w:tab w:val="left" w:pos="11908"/>
+          <w:tab w:val="left" w:pos="12824"/>
+          <w:tab w:val="left" w:pos="13740"/>
+          <w:tab w:val="left" w:pos="14656"/>
+        </w:tabs>
+        <w:wordWrap w:val="0"/>
+        <w:spacing w:line="330" w:lineRule="atLeast"/>
+        <w:rPr>
+          <w:rFonts w:ascii="Consolas" w:eastAsia="Times New Roman" w:hAnsi="Consolas" w:cs="Courier New"/>
+          <w:color w:val="0F1115"/>
+          <w:sz w:val="20"/>
+          <w:szCs w:val="20"/>
+          <w:lang w:eastAsia="it-IT"/>
+        </w:rPr>
+      </w:pPr>
+      <w:r>
+        <w:rPr>
+          <w:rFonts w:ascii="Consolas" w:eastAsia="Times New Roman" w:hAnsi="Consolas" w:cs="Courier New"/>
+          <w:color w:val="383A42"/>
+          <w:sz w:val="20"/>
+          <w:szCs w:val="20"/>
+          <w:lang w:eastAsia="it-IT"/>
+        </w:rPr>
+        <w:t>}</w:t>
+      </w:r>
+    </w:p>
+    <w:p>
+      <w:pPr>
+        <w:shd w:val="clear" w:color="auto" w:fill="FFFFFF"/>
+        <w:spacing w:before="480" w:after="240" w:line="480" w:lineRule="atLeast"/>
+        <w:outlineLvl w:val="1"/>
+        <w:rPr>
+          <w:rFonts w:ascii="Segoe UI" w:eastAsia="Times New Roman" w:hAnsi="Segoe UI" w:cs="Segoe UI"/>
+          <w:b/>
+          <w:bCs/>
+          <w:color w:val="0F1115"/>
+          <w:sz w:val="33"/>
+          <w:szCs w:val="33"/>
+          <w:lang w:eastAsia="it-IT"/>
+        </w:rPr>
+      </w:pPr>
+      <w:r>
+        <w:rPr>
+          <w:rFonts w:ascii="Segoe UI" w:eastAsia="Times New Roman" w:hAnsi="Segoe UI" w:cs="Segoe UI"/>
+          <w:b/>
+          <w:bCs/>
+          <w:color w:val="0F1115"/>
+          <w:sz w:val="33"/>
+          <w:szCs w:val="33"/>
+          <w:lang w:eastAsia="it-IT"/>
+        </w:rPr>
+        <w:t xml:space="preserve">Soluzione 4: Creare un </w:t>
+      </w:r>
+      <w:proofErr w:type="spellStart"/>
+      <w:r>
+        <w:rPr>
+          <w:rFonts w:ascii="Segoe UI" w:eastAsia="Times New Roman" w:hAnsi="Segoe UI" w:cs="Segoe UI"/>
+          <w:b/>
+          <w:bCs/>
+          <w:color w:val="0F1115"/>
+          <w:sz w:val="33"/>
+          <w:szCs w:val="33"/>
+          <w:lang w:eastAsia="it-IT"/>
+        </w:rPr>
+        <w:t>installer</w:t>
+      </w:r>
+      <w:proofErr w:type="spellEnd"/>
+      <w:r>
+        <w:rPr>
+          <w:rFonts w:ascii="Segoe UI" w:eastAsia="Times New Roman" w:hAnsi="Segoe UI" w:cs="Segoe UI"/>
+          <w:b/>
+          <w:bCs/>
+          <w:color w:val="0F1115"/>
+          <w:sz w:val="33"/>
+          <w:szCs w:val="33"/>
+          <w:lang w:eastAsia="it-IT"/>
+        </w:rPr>
+        <w:t xml:space="preserve"> completo</w:t>
+      </w:r>
+    </w:p>
+    <w:p>
+      <w:pPr>
+        <w:shd w:val="clear" w:color="auto" w:fill="FFFFFF"/>
+        <w:spacing w:before="240" w:after="240" w:line="240" w:lineRule="auto"/>
+        <w:rPr>
+          <w:rFonts w:ascii="Segoe UI" w:eastAsia="Times New Roman" w:hAnsi="Segoe UI" w:cs="Segoe UI"/>
+          <w:color w:val="0F1115"/>
+          <w:sz w:val="24"/>
+          <w:szCs w:val="24"/>
+          <w:lang w:eastAsia="it-IT"/>
+        </w:rPr>
+      </w:pPr>
+      <w:r>
+        <w:rPr>
+          <w:rFonts w:ascii="Segoe UI" w:eastAsia="Times New Roman" w:hAnsi="Segoe UI" w:cs="Segoe UI"/>
+          <w:color w:val="0F1115"/>
+          <w:sz w:val="24"/>
+          <w:szCs w:val="24"/>
+          <w:lang w:eastAsia="it-IT"/>
+        </w:rPr>
+        <w:t>Usa strumenti come:</w:t>
+      </w:r>
+    </w:p>
+    <w:p>
+      <w:pPr>
+        <w:numPr>
+          <w:ilvl w:val="0"/>
+          <w:numId w:val="9"/>
+        </w:numPr>
+        <w:shd w:val="clear" w:color="auto" w:fill="FFFFFF"/>
+        <w:spacing w:before="100" w:beforeAutospacing="1" w:after="0" w:line="240" w:lineRule="auto"/>
+        <w:ind w:left="0"/>
+        <w:rPr>
+          <w:rFonts w:ascii="Segoe UI" w:eastAsia="Times New Roman" w:hAnsi="Segoe UI" w:cs="Segoe UI"/>
+          <w:color w:val="0F1115"/>
+          <w:sz w:val="24"/>
+          <w:szCs w:val="24"/>
+          <w:lang w:eastAsia="it-IT"/>
+        </w:rPr>
+      </w:pPr>
+      <w:r>
+        <w:rPr>
+          <w:rFonts w:ascii="Segoe UI" w:eastAsia="Times New Roman" w:hAnsi="Segoe UI" w:cs="Segoe UI"/>
+          <w:b/>
+          <w:bCs/>
+          <w:color w:val="0F1115"/>
+          <w:sz w:val="24"/>
+          <w:szCs w:val="24"/>
+          <w:lang w:eastAsia="it-IT"/>
+        </w:rPr>
+        <w:t>Inno Setup</w:t>
+      </w:r>
+      <w:r>
+        <w:rPr>
+          <w:rFonts w:ascii="Segoe UI" w:eastAsia="Times New Roman" w:hAnsi="Segoe UI" w:cs="Segoe UI"/>
+          <w:color w:val="0F1115"/>
+          <w:sz w:val="24"/>
+          <w:szCs w:val="24"/>
+          <w:lang w:eastAsia="it-IT"/>
+        </w:rPr>
+        <w:t> (gratuito)</w:t>
+      </w:r>
+    </w:p>
+    <w:p>
+      <w:pPr>
+        <w:numPr>
+          <w:ilvl w:val="0"/>
+          <w:numId w:val="9"/>
+        </w:numPr>
+        <w:shd w:val="clear" w:color="auto" w:fill="FFFFFF"/>
+        <w:spacing w:before="100" w:beforeAutospacing="1" w:after="0" w:line="240" w:lineRule="auto"/>
+        <w:ind w:left="0"/>
+        <w:rPr>
+          <w:rFonts w:ascii="Segoe UI" w:eastAsia="Times New Roman" w:hAnsi="Segoe UI" w:cs="Segoe UI"/>
+          <w:color w:val="0F1115"/>
+          <w:sz w:val="24"/>
+          <w:szCs w:val="24"/>
+          <w:lang w:eastAsia="it-IT"/>
+        </w:rPr>
+      </w:pPr>
+      <w:r>
+        <w:rPr>
+          <w:rFonts w:ascii="Segoe UI" w:eastAsia="Times New Roman" w:hAnsi="Segoe UI" w:cs="Segoe UI"/>
+          <w:b/>
+          <w:bCs/>
+          <w:color w:val="0F1115"/>
+          <w:sz w:val="24"/>
+          <w:szCs w:val="24"/>
+          <w:lang w:eastAsia="it-IT"/>
+        </w:rPr>
+        <w:t>NSIS</w:t>
+      </w:r>
+      <w:r>
+        <w:rPr>
+          <w:rFonts w:ascii="Segoe UI" w:eastAsia="Times New Roman" w:hAnsi="Segoe UI" w:cs="Segoe UI"/>
+          <w:color w:val="0F1115"/>
+          <w:sz w:val="24"/>
+          <w:szCs w:val="24"/>
+          <w:lang w:eastAsia="it-IT"/>
+        </w:rPr>
+        <w:t> (gratuito)</w:t>
+      </w:r>
+    </w:p>
+    <w:p>
+      <w:pPr>
+        <w:numPr>
+          <w:ilvl w:val="0"/>
+          <w:numId w:val="9"/>
+        </w:numPr>
+        <w:shd w:val="clear" w:color="auto" w:fill="FFFFFF"/>
+        <w:spacing w:before="100" w:beforeAutospacing="1" w:after="0" w:line="240" w:lineRule="auto"/>
+        <w:ind w:left="0"/>
+        <w:rPr>
+          <w:rFonts w:ascii="Segoe UI" w:eastAsia="Times New Roman" w:hAnsi="Segoe UI" w:cs="Segoe UI"/>
+          <w:color w:val="0F1115"/>
+          <w:sz w:val="24"/>
+          <w:szCs w:val="24"/>
+          <w:lang w:eastAsia="it-IT"/>
+        </w:rPr>
+      </w:pPr>
+      <w:r>
+        <w:rPr>
+          <w:rFonts w:ascii="Segoe UI" w:eastAsia="Times New Roman" w:hAnsi="Segoe UI" w:cs="Segoe UI"/>
+          <w:b/>
+          <w:bCs/>
+          <w:color w:val="0F1115"/>
+          <w:sz w:val="24"/>
+          <w:szCs w:val="24"/>
+          <w:lang w:eastAsia="it-IT"/>
+        </w:rPr>
+        <w:t>Advanced Installer</w:t>
+      </w:r>
+      <w:r>
+        <w:rPr>
+          <w:rFonts w:ascii="Segoe UI" w:eastAsia="Times New Roman" w:hAnsi="Segoe UI" w:cs="Segoe UI"/>
+          <w:color w:val="0F1115"/>
+          <w:sz w:val="24"/>
+          <w:szCs w:val="24"/>
+          <w:lang w:eastAsia="it-IT"/>
+        </w:rPr>
+        <w:t> (a pagamento)</w:t>
+      </w:r>
+    </w:p>
+    <w:p>
+      <w:pPr>
+        <w:shd w:val="clear" w:color="auto" w:fill="FFFFFF"/>
+        <w:spacing w:before="240" w:after="240" w:line="240" w:lineRule="auto"/>
+        <w:rPr>
+          <w:rFonts w:ascii="Segoe UI" w:eastAsia="Times New Roman" w:hAnsi="Segoe UI" w:cs="Segoe UI"/>
+          <w:color w:val="0F1115"/>
+          <w:sz w:val="24"/>
+          <w:szCs w:val="24"/>
+          <w:lang w:eastAsia="it-IT"/>
+        </w:rPr>
+      </w:pPr>
+      <w:proofErr w:type="spellStart"/>
+      <w:r>
+        <w:rPr>
+          <w:rFonts w:ascii="Segoe UI" w:eastAsia="Times New Roman" w:hAnsi="Segoe UI" w:cs="Segoe UI"/>
+          <w:color w:val="0F1115"/>
+          <w:sz w:val="24"/>
+          <w:szCs w:val="24"/>
+          <w:lang w:eastAsia="it-IT"/>
+        </w:rPr>
+        <w:t>Nell'installer</w:t>
+      </w:r>
+      <w:proofErr w:type="spellEnd"/>
+      <w:r>
+        <w:rPr>
+          <w:rFonts w:ascii="Segoe UI" w:eastAsia="Times New Roman" w:hAnsi="Segoe UI" w:cs="Segoe UI"/>
+          <w:color w:val="0F1115"/>
+          <w:sz w:val="24"/>
+          <w:szCs w:val="24"/>
+          <w:lang w:eastAsia="it-IT"/>
+        </w:rPr>
+        <w:t>, includi:</w:t>
+      </w:r>
+    </w:p>
+    <w:p>
+      <w:pPr>
+        <w:numPr>
+          <w:ilvl w:val="0"/>
+          <w:numId w:val="10"/>
+        </w:numPr>
+        <w:shd w:val="clear" w:color="auto" w:fill="FFFFFF"/>
+        <w:spacing w:before="100" w:beforeAutospacing="1" w:after="0" w:line="240" w:lineRule="auto"/>
+        <w:ind w:left="0"/>
+        <w:rPr>
+          <w:rFonts w:ascii="Segoe UI" w:eastAsia="Times New Roman" w:hAnsi="Segoe UI" w:cs="Segoe UI"/>
+          <w:color w:val="0F1115"/>
+          <w:sz w:val="24"/>
+          <w:szCs w:val="24"/>
+          <w:lang w:eastAsia="it-IT"/>
+        </w:rPr>
+      </w:pPr>
+      <w:r>
+        <w:rPr>
+          <w:rFonts w:ascii="Segoe UI" w:eastAsia="Times New Roman" w:hAnsi="Segoe UI" w:cs="Segoe UI"/>
+          <w:color w:val="0F1115"/>
+          <w:sz w:val="24"/>
+          <w:szCs w:val="24"/>
+          <w:lang w:eastAsia="it-IT"/>
+        </w:rPr>
+        <w:t xml:space="preserve">Il pacchetto VC++ </w:t>
+      </w:r>
+      <w:proofErr w:type="spellStart"/>
+      <w:r>
+        <w:rPr>
+          <w:rFonts w:ascii="Segoe UI" w:eastAsia="Times New Roman" w:hAnsi="Segoe UI" w:cs="Segoe UI"/>
+          <w:color w:val="0F1115"/>
+          <w:sz w:val="24"/>
+          <w:szCs w:val="24"/>
+          <w:lang w:eastAsia="it-IT"/>
+        </w:rPr>
+        <w:t>Redistributable</w:t>
+      </w:r>
+      <w:proofErr w:type="spellEnd"/>
+    </w:p>
+    <w:p>
+      <w:pPr>
+        <w:numPr>
+          <w:ilvl w:val="0"/>
+          <w:numId w:val="10"/>
+        </w:numPr>
+        <w:shd w:val="clear" w:color="auto" w:fill="FFFFFF"/>
+        <w:spacing w:before="100" w:beforeAutospacing="1" w:after="0" w:line="240" w:lineRule="auto"/>
+        <w:ind w:left="0"/>
+        <w:rPr>
+          <w:rFonts w:ascii="Segoe UI" w:eastAsia="Times New Roman" w:hAnsi="Segoe UI" w:cs="Segoe UI"/>
+          <w:color w:val="0F1115"/>
+          <w:sz w:val="24"/>
+          <w:szCs w:val="24"/>
+          <w:lang w:eastAsia="it-IT"/>
+        </w:rPr>
+      </w:pPr>
+      <w:r>
+        <w:rPr>
+          <w:rFonts w:ascii="Segoe UI" w:eastAsia="Times New Roman" w:hAnsi="Segoe UI" w:cs="Segoe UI"/>
+          <w:color w:val="0F1115"/>
+          <w:sz w:val="24"/>
+          <w:szCs w:val="24"/>
+          <w:lang w:eastAsia="it-IT"/>
+        </w:rPr>
+        <w:t>La tua applicazione</w:t>
+      </w:r>
+    </w:p>
+    <w:p>
+      <w:pPr>
+        <w:numPr>
+          <w:ilvl w:val="0"/>
+          <w:numId w:val="10"/>
+        </w:numPr>
+        <w:shd w:val="clear" w:color="auto" w:fill="FFFFFF"/>
+        <w:spacing w:before="100" w:beforeAutospacing="1" w:after="0" w:line="240" w:lineRule="auto"/>
+        <w:ind w:left="0"/>
+        <w:rPr>
+          <w:rFonts w:ascii="Segoe UI" w:eastAsia="Times New Roman" w:hAnsi="Segoe UI" w:cs="Segoe UI"/>
+          <w:color w:val="0F1115"/>
+          <w:sz w:val="24"/>
+          <w:szCs w:val="24"/>
+          <w:lang w:eastAsia="it-IT"/>
+        </w:rPr>
+      </w:pPr>
+      <w:r>
+        <w:rPr>
+          <w:rFonts w:ascii="Segoe UI" w:eastAsia="Times New Roman" w:hAnsi="Segoe UI" w:cs="Segoe UI"/>
+          <w:color w:val="0F1115"/>
+          <w:sz w:val="24"/>
+          <w:szCs w:val="24"/>
+          <w:lang w:eastAsia="it-IT"/>
+        </w:rPr>
+        <w:t>Eventuali dipendenze</w:t>
+      </w:r>
+    </w:p>
+    <w:p>
+      <w:pPr>
+        <w:shd w:val="clear" w:color="auto" w:fill="FFFFFF"/>
+        <w:spacing w:before="480" w:after="240" w:line="480" w:lineRule="atLeast"/>
+        <w:outlineLvl w:val="1"/>
+        <w:rPr>
+          <w:rFonts w:ascii="Segoe UI" w:eastAsia="Times New Roman" w:hAnsi="Segoe UI" w:cs="Segoe UI"/>
+          <w:b/>
+          <w:bCs/>
+          <w:color w:val="0F1115"/>
+          <w:sz w:val="33"/>
+          <w:szCs w:val="33"/>
+          <w:lang w:eastAsia="it-IT"/>
+        </w:rPr>
+      </w:pPr>
+      <w:r>
+        <w:rPr>
+          <w:rFonts w:ascii="Segoe UI" w:eastAsia="Times New Roman" w:hAnsi="Segoe UI" w:cs="Segoe UI"/>
+          <w:b/>
+          <w:bCs/>
+          <w:color w:val="0F1115"/>
+          <w:sz w:val="33"/>
+          <w:szCs w:val="33"/>
+          <w:lang w:eastAsia="it-IT"/>
+        </w:rPr>
+        <w:t>Soluzione Rapida per Test Immediate:</w:t>
+      </w:r>
+    </w:p>
+    <w:p>
+      <w:pPr>
+        <w:numPr>
+          <w:ilvl w:val="0"/>
+          <w:numId w:val="11"/>
+        </w:numPr>
+        <w:shd w:val="clear" w:color="auto" w:fill="FFFFFF"/>
+        <w:spacing w:before="100" w:beforeAutospacing="1" w:after="120" w:line="240" w:lineRule="auto"/>
+        <w:ind w:left="0"/>
+        <w:rPr>
+          <w:rFonts w:ascii="Segoe UI" w:eastAsia="Times New Roman" w:hAnsi="Segoe UI" w:cs="Segoe UI"/>
+          <w:color w:val="0F1115"/>
+          <w:sz w:val="24"/>
+          <w:szCs w:val="24"/>
+          <w:lang w:eastAsia="it-IT"/>
+        </w:rPr>
+      </w:pPr>
+      <w:r>
+        <w:rPr>
+          <w:rFonts w:ascii="Segoe UI" w:eastAsia="Times New Roman" w:hAnsi="Segoe UI" w:cs="Segoe UI"/>
+          <w:color w:val="0F1115"/>
+          <w:sz w:val="24"/>
+          <w:szCs w:val="24"/>
+          <w:lang w:eastAsia="it-IT"/>
+        </w:rPr>
+        <w:t>Crea un file </w:t>
+      </w:r>
+      <w:r>
+        <w:rPr>
+          <w:rFonts w:ascii="Consolas" w:eastAsia="Times New Roman" w:hAnsi="Consolas" w:cs="Courier New"/>
+          <w:color w:val="0F1115"/>
+          <w:sz w:val="20"/>
+          <w:szCs w:val="20"/>
+          <w:shd w:val="clear" w:color="auto" w:fill="EBEEF2"/>
+          <w:lang w:eastAsia="it-IT"/>
+        </w:rPr>
+        <w:t>install_redist.bat</w:t>
+      </w:r>
+      <w:r>
+        <w:rPr>
+          <w:rFonts w:ascii="Segoe UI" w:eastAsia="Times New Roman" w:hAnsi="Segoe UI" w:cs="Segoe UI"/>
+          <w:color w:val="0F1115"/>
+          <w:sz w:val="24"/>
+          <w:szCs w:val="24"/>
+          <w:lang w:eastAsia="it-IT"/>
+        </w:rPr>
+        <w:t> nella cartella dell'</w:t>
+      </w:r>
+      <w:proofErr w:type="spellStart"/>
+      <w:r>
+        <w:rPr>
+          <w:rFonts w:ascii="Segoe UI" w:eastAsia="Times New Roman" w:hAnsi="Segoe UI" w:cs="Segoe UI"/>
+          <w:color w:val="0F1115"/>
+          <w:sz w:val="24"/>
+          <w:szCs w:val="24"/>
+          <w:lang w:eastAsia="it-IT"/>
+        </w:rPr>
+        <w:t>app</w:t>
+      </w:r>
+      <w:proofErr w:type="spellEnd"/>
+      <w:r>
+        <w:rPr>
+          <w:rFonts w:ascii="Segoe UI" w:eastAsia="Times New Roman" w:hAnsi="Segoe UI" w:cs="Segoe UI"/>
+          <w:color w:val="0F1115"/>
+          <w:sz w:val="24"/>
+          <w:szCs w:val="24"/>
+          <w:lang w:eastAsia="it-IT"/>
+        </w:rPr>
+        <w:t>:</w:t>
+      </w:r>
+    </w:p>
+    <w:p>
+      <w:pPr>
+        <w:shd w:val="clear" w:color="auto" w:fill="FFFFFF"/>
+        <w:spacing w:beforeAutospacing="1" w:after="0" w:afterAutospacing="1" w:line="189" w:lineRule="atLeast"/>
+        <w:rPr>
+          <w:rFonts w:ascii="Segoe UI" w:eastAsia="Times New Roman" w:hAnsi="Segoe UI" w:cs="Segoe UI"/>
+          <w:color w:val="0F1115"/>
+          <w:sz w:val="19"/>
+          <w:szCs w:val="19"/>
+          <w:lang w:val="en-GB" w:eastAsia="it-IT"/>
+        </w:rPr>
+      </w:pPr>
+      <w:r>
+        <w:rPr>
+          <w:rFonts w:ascii="Consolas" w:eastAsia="Times New Roman" w:hAnsi="Consolas" w:cs="Segoe UI"/>
+          <w:color w:val="0F1115"/>
+          <w:sz w:val="18"/>
+          <w:szCs w:val="18"/>
+          <w:lang w:val="en-GB" w:eastAsia="it-IT"/>
+        </w:rPr>
+        <w:t>batch</w:t>
+      </w:r>
+    </w:p>
+    <w:p>
+      <w:pPr>
+        <w:shd w:val="clear" w:color="auto" w:fill="FFFFFF"/>
+        <w:tabs>
+          <w:tab w:val="left" w:pos="916"/>
+          <w:tab w:val="left" w:pos="1832"/>
+          <w:tab w:val="left" w:pos="2748"/>
+          <w:tab w:val="left" w:pos="3664"/>
+          <w:tab w:val="left" w:pos="4580"/>
+          <w:tab w:val="left" w:pos="5496"/>
+          <w:tab w:val="left" w:pos="6412"/>
+          <w:tab w:val="left" w:pos="7328"/>
+          <w:tab w:val="left" w:pos="8244"/>
+          <w:tab w:val="left" w:pos="9160"/>
+          <w:tab w:val="left" w:pos="10076"/>
+          <w:tab w:val="left" w:pos="10992"/>
+          <w:tab w:val="left" w:pos="11908"/>
+          <w:tab w:val="left" w:pos="12824"/>
+          <w:tab w:val="left" w:pos="13740"/>
+          <w:tab w:val="left" w:pos="14656"/>
+        </w:tabs>
+        <w:wordWrap w:val="0"/>
+        <w:spacing w:after="0" w:line="330" w:lineRule="atLeast"/>
+        <w:rPr>
+          <w:rFonts w:ascii="Consolas" w:eastAsia="Times New Roman" w:hAnsi="Consolas" w:cs="Courier New"/>
+          <w:color w:val="0F1115"/>
+          <w:sz w:val="20"/>
+          <w:szCs w:val="20"/>
+          <w:lang w:val="en-GB" w:eastAsia="it-IT"/>
+        </w:rPr>
+      </w:pPr>
+      <w:r>
+        <w:rPr>
+          <w:rFonts w:ascii="Consolas" w:eastAsia="Times New Roman" w:hAnsi="Consolas" w:cs="Courier New"/>
+          <w:color w:val="4078F2"/>
+          <w:sz w:val="20"/>
+          <w:szCs w:val="20"/>
+          <w:lang w:val="en-GB" w:eastAsia="it-IT"/>
+        </w:rPr>
+        <w:t>@</w:t>
+      </w:r>
+      <w:r>
+        <w:rPr>
+          <w:rFonts w:ascii="Consolas" w:eastAsia="Times New Roman" w:hAnsi="Consolas" w:cs="Courier New"/>
+          <w:color w:val="A626A4"/>
+          <w:sz w:val="20"/>
+          <w:szCs w:val="20"/>
+          <w:lang w:val="en-GB" w:eastAsia="it-IT"/>
+        </w:rPr>
+        <w:t>echo</w:t>
+      </w:r>
+      <w:r>
+        <w:rPr>
+          <w:rFonts w:ascii="Consolas" w:eastAsia="Times New Roman" w:hAnsi="Consolas" w:cs="Courier New"/>
+          <w:color w:val="0F1115"/>
+          <w:sz w:val="20"/>
+          <w:szCs w:val="20"/>
+          <w:lang w:val="en-GB" w:eastAsia="it-IT"/>
+        </w:rPr>
+        <w:t xml:space="preserve"> off</w:t>
+      </w:r>
+    </w:p>
+    <w:p>
+      <w:pPr>
+        <w:shd w:val="clear" w:color="auto" w:fill="FFFFFF"/>
+        <w:tabs>
+          <w:tab w:val="left" w:pos="916"/>
+          <w:tab w:val="left" w:pos="1832"/>
+          <w:tab w:val="left" w:pos="2748"/>
+          <w:tab w:val="left" w:pos="3664"/>
+          <w:tab w:val="left" w:pos="4580"/>
+          <w:tab w:val="left" w:pos="5496"/>
+          <w:tab w:val="left" w:pos="6412"/>
+          <w:tab w:val="left" w:pos="7328"/>
+          <w:tab w:val="left" w:pos="8244"/>
+          <w:tab w:val="left" w:pos="9160"/>
+          <w:tab w:val="left" w:pos="10076"/>
+          <w:tab w:val="left" w:pos="10992"/>
+          <w:tab w:val="left" w:pos="11908"/>
+          <w:tab w:val="left" w:pos="12824"/>
+          <w:tab w:val="left" w:pos="13740"/>
+          <w:tab w:val="left" w:pos="14656"/>
+        </w:tabs>
+        <w:wordWrap w:val="0"/>
+        <w:spacing w:after="0" w:line="330" w:lineRule="atLeast"/>
+        <w:rPr>
+          <w:rFonts w:ascii="Consolas" w:eastAsia="Times New Roman" w:hAnsi="Consolas" w:cs="Courier New"/>
+          <w:color w:val="0F1115"/>
+          <w:sz w:val="20"/>
+          <w:szCs w:val="20"/>
+          <w:lang w:val="en-GB" w:eastAsia="it-IT"/>
+        </w:rPr>
+      </w:pPr>
+      <w:r>
+        <w:rPr>
+          <w:rFonts w:ascii="Consolas" w:eastAsia="Times New Roman" w:hAnsi="Consolas" w:cs="Courier New"/>
+          <w:color w:val="A626A4"/>
+          <w:sz w:val="20"/>
+          <w:szCs w:val="20"/>
+          <w:lang w:val="en-GB" w:eastAsia="it-IT"/>
+        </w:rPr>
+        <w:t>echo</w:t>
+      </w:r>
+      <w:r>
+        <w:rPr>
+          <w:rFonts w:ascii="Consolas" w:eastAsia="Times New Roman" w:hAnsi="Consolas" w:cs="Courier New"/>
+          <w:color w:val="0F1115"/>
+          <w:sz w:val="20"/>
+          <w:szCs w:val="20"/>
+          <w:lang w:val="en-GB" w:eastAsia="it-IT"/>
+        </w:rPr>
+        <w:t xml:space="preserve"> Installing Visual C++ Redistributable...</w:t>
+      </w:r>
+    </w:p>
+    <w:p>
+      <w:pPr>
+        <w:shd w:val="clear" w:color="auto" w:fill="FFFFFF"/>
+        <w:tabs>
+          <w:tab w:val="left" w:pos="916"/>
+          <w:tab w:val="left" w:pos="1832"/>
+          <w:tab w:val="left" w:pos="2748"/>
+          <w:tab w:val="left" w:pos="3664"/>
+          <w:tab w:val="left" w:pos="4580"/>
+          <w:tab w:val="left" w:pos="5496"/>
+          <w:tab w:val="left" w:pos="6412"/>
+          <w:tab w:val="left" w:pos="7328"/>
+          <w:tab w:val="left" w:pos="8244"/>
+          <w:tab w:val="left" w:pos="9160"/>
+          <w:tab w:val="left" w:pos="10076"/>
+          <w:tab w:val="left" w:pos="10992"/>
+          <w:tab w:val="left" w:pos="11908"/>
+          <w:tab w:val="left" w:pos="12824"/>
+          <w:tab w:val="left" w:pos="13740"/>
+          <w:tab w:val="left" w:pos="14656"/>
+        </w:tabs>
+        <w:wordWrap w:val="0"/>
+        <w:spacing w:after="0" w:line="330" w:lineRule="atLeast"/>
+        <w:rPr>
+          <w:rFonts w:ascii="Consolas" w:eastAsia="Times New Roman" w:hAnsi="Consolas" w:cs="Courier New"/>
+          <w:color w:val="0F1115"/>
+          <w:sz w:val="20"/>
+          <w:szCs w:val="20"/>
+          <w:lang w:eastAsia="it-IT"/>
+        </w:rPr>
+      </w:pPr>
+      <w:proofErr w:type="spellStart"/>
+      <w:r>
+        <w:rPr>
+          <w:rFonts w:ascii="Consolas" w:eastAsia="Times New Roman" w:hAnsi="Consolas" w:cs="Courier New"/>
+          <w:color w:val="A626A4"/>
+          <w:sz w:val="20"/>
+          <w:szCs w:val="20"/>
+          <w:lang w:eastAsia="it-IT"/>
+        </w:rPr>
+        <w:t>curl</w:t>
+      </w:r>
+      <w:proofErr w:type="spellEnd"/>
+      <w:r>
+        <w:rPr>
+          <w:rFonts w:ascii="Consolas" w:eastAsia="Times New Roman" w:hAnsi="Consolas" w:cs="Courier New"/>
+          <w:color w:val="0F1115"/>
+          <w:sz w:val="20"/>
+          <w:szCs w:val="20"/>
+          <w:lang w:eastAsia="it-IT"/>
+        </w:rPr>
+        <w:t xml:space="preserve"> </w:t>
+      </w:r>
+      <w:r>
+        <w:rPr>
+          <w:rFonts w:ascii="Consolas" w:eastAsia="Times New Roman" w:hAnsi="Consolas" w:cs="Courier New"/>
+          <w:color w:val="B76B01"/>
+          <w:sz w:val="20"/>
+          <w:szCs w:val="20"/>
+          <w:lang w:eastAsia="it-IT"/>
+        </w:rPr>
+        <w:t>-L</w:t>
+      </w:r>
+      <w:r>
+        <w:rPr>
+          <w:rFonts w:ascii="Consolas" w:eastAsia="Times New Roman" w:hAnsi="Consolas" w:cs="Courier New"/>
+          <w:color w:val="0F1115"/>
+          <w:sz w:val="20"/>
+          <w:szCs w:val="20"/>
+          <w:lang w:eastAsia="it-IT"/>
+        </w:rPr>
+        <w:t xml:space="preserve"> </w:t>
+      </w:r>
+      <w:r>
+        <w:rPr>
+          <w:rFonts w:ascii="Consolas" w:eastAsia="Times New Roman" w:hAnsi="Consolas" w:cs="Courier New"/>
+          <w:color w:val="B76B01"/>
+          <w:sz w:val="20"/>
+          <w:szCs w:val="20"/>
+          <w:lang w:eastAsia="it-IT"/>
+        </w:rPr>
+        <w:t>-o</w:t>
+      </w:r>
+      <w:r>
+        <w:rPr>
+          <w:rFonts w:ascii="Consolas" w:eastAsia="Times New Roman" w:hAnsi="Consolas" w:cs="Courier New"/>
+          <w:color w:val="0F1115"/>
+          <w:sz w:val="20"/>
+          <w:szCs w:val="20"/>
+          <w:lang w:eastAsia="it-IT"/>
+        </w:rPr>
+        <w:t xml:space="preserve"> vcredist.exe https://aka.ms/vs/</w:t>
+      </w:r>
+      <w:r>
+        <w:rPr>
+          <w:rFonts w:ascii="Consolas" w:eastAsia="Times New Roman" w:hAnsi="Consolas" w:cs="Courier New"/>
+          <w:color w:val="B76B01"/>
+          <w:sz w:val="20"/>
+          <w:szCs w:val="20"/>
+          <w:lang w:eastAsia="it-IT"/>
+        </w:rPr>
+        <w:t>17</w:t>
+      </w:r>
+      <w:r>
+        <w:rPr>
+          <w:rFonts w:ascii="Consolas" w:eastAsia="Times New Roman" w:hAnsi="Consolas" w:cs="Courier New"/>
+          <w:color w:val="0F1115"/>
+          <w:sz w:val="20"/>
+          <w:szCs w:val="20"/>
+          <w:lang w:eastAsia="it-IT"/>
+        </w:rPr>
+        <w:t>/release/vc_redist.x64.exe</w:t>
+      </w:r>
+    </w:p>
+    <w:p>
+      <w:pPr>
+        <w:shd w:val="clear" w:color="auto" w:fill="FFFFFF"/>
+        <w:tabs>
+          <w:tab w:val="left" w:pos="916"/>
+          <w:tab w:val="left" w:pos="1832"/>
+          <w:tab w:val="left" w:pos="2748"/>
+          <w:tab w:val="left" w:pos="3664"/>
+          <w:tab w:val="left" w:pos="4580"/>
+          <w:tab w:val="left" w:pos="5496"/>
+          <w:tab w:val="left" w:pos="6412"/>
+          <w:tab w:val="left" w:pos="7328"/>
+          <w:tab w:val="left" w:pos="8244"/>
+          <w:tab w:val="left" w:pos="9160"/>
+          <w:tab w:val="left" w:pos="10076"/>
+          <w:tab w:val="left" w:pos="10992"/>
+          <w:tab w:val="left" w:pos="11908"/>
+          <w:tab w:val="left" w:pos="12824"/>
+          <w:tab w:val="left" w:pos="13740"/>
+          <w:tab w:val="left" w:pos="14656"/>
+        </w:tabs>
+        <w:wordWrap w:val="0"/>
+        <w:spacing w:after="0" w:line="330" w:lineRule="atLeast"/>
+        <w:rPr>
+          <w:rFonts w:ascii="Consolas" w:eastAsia="Times New Roman" w:hAnsi="Consolas" w:cs="Courier New"/>
+          <w:color w:val="0F1115"/>
+          <w:sz w:val="20"/>
+          <w:szCs w:val="20"/>
+          <w:lang w:val="en-GB" w:eastAsia="it-IT"/>
+        </w:rPr>
+      </w:pPr>
+      <w:r>
+        <w:rPr>
+          <w:rFonts w:ascii="Consolas" w:eastAsia="Times New Roman" w:hAnsi="Consolas" w:cs="Courier New"/>
+          <w:color w:val="A626A4"/>
+          <w:sz w:val="20"/>
+          <w:szCs w:val="20"/>
+          <w:lang w:val="en-GB" w:eastAsia="it-IT"/>
+        </w:rPr>
+        <w:t>vcredist</w:t>
+      </w:r>
+      <w:r>
+        <w:rPr>
+          <w:rFonts w:ascii="Consolas" w:eastAsia="Times New Roman" w:hAnsi="Consolas" w:cs="Courier New"/>
+          <w:color w:val="0F1115"/>
+          <w:sz w:val="20"/>
+          <w:szCs w:val="20"/>
+          <w:lang w:val="en-GB" w:eastAsia="it-IT"/>
+        </w:rPr>
+        <w:t xml:space="preserve">.exe </w:t>
+      </w:r>
+      <w:r>
+        <w:rPr>
+          <w:rFonts w:ascii="Consolas" w:eastAsia="Times New Roman" w:hAnsi="Consolas" w:cs="Courier New"/>
+          <w:color w:val="B76B01"/>
+          <w:sz w:val="20"/>
+          <w:szCs w:val="20"/>
+          <w:lang w:val="en-GB" w:eastAsia="it-IT"/>
+        </w:rPr>
+        <w:t>/install</w:t>
+      </w:r>
+      <w:r>
+        <w:rPr>
+          <w:rFonts w:ascii="Consolas" w:eastAsia="Times New Roman" w:hAnsi="Consolas" w:cs="Courier New"/>
+          <w:color w:val="0F1115"/>
+          <w:sz w:val="20"/>
+          <w:szCs w:val="20"/>
+          <w:lang w:val="en-GB" w:eastAsia="it-IT"/>
+        </w:rPr>
+        <w:t xml:space="preserve"> </w:t>
+      </w:r>
+      <w:r>
+        <w:rPr>
+          <w:rFonts w:ascii="Consolas" w:eastAsia="Times New Roman" w:hAnsi="Consolas" w:cs="Courier New"/>
+          <w:color w:val="B76B01"/>
+          <w:sz w:val="20"/>
+          <w:szCs w:val="20"/>
+          <w:lang w:val="en-GB" w:eastAsia="it-IT"/>
+        </w:rPr>
+        <w:t>/quiet</w:t>
+      </w:r>
+      <w:r>
+        <w:rPr>
+          <w:rFonts w:ascii="Consolas" w:eastAsia="Times New Roman" w:hAnsi="Consolas" w:cs="Courier New"/>
+          <w:color w:val="0F1115"/>
+          <w:sz w:val="20"/>
+          <w:szCs w:val="20"/>
+          <w:lang w:val="en-GB" w:eastAsia="it-IT"/>
+        </w:rPr>
+        <w:t xml:space="preserve"> </w:t>
+      </w:r>
+      <w:r>
+        <w:rPr>
+          <w:rFonts w:ascii="Consolas" w:eastAsia="Times New Roman" w:hAnsi="Consolas" w:cs="Courier New"/>
+          <w:color w:val="B76B01"/>
+          <w:sz w:val="20"/>
+          <w:szCs w:val="20"/>
+          <w:lang w:val="en-GB" w:eastAsia="it-IT"/>
+        </w:rPr>
+        <w:t>/</w:t>
+      </w:r>
+      <w:proofErr w:type="spellStart"/>
+      <w:r>
+        <w:rPr>
+          <w:rFonts w:ascii="Consolas" w:eastAsia="Times New Roman" w:hAnsi="Consolas" w:cs="Courier New"/>
+          <w:color w:val="B76B01"/>
+          <w:sz w:val="20"/>
+          <w:szCs w:val="20"/>
+          <w:lang w:val="en-GB" w:eastAsia="it-IT"/>
+        </w:rPr>
+        <w:t>norestart</w:t>
+      </w:r>
+      <w:proofErr w:type="spellEnd"/>
+    </w:p>
+    <w:p>
+      <w:pPr>
+        <w:shd w:val="clear" w:color="auto" w:fill="FFFFFF"/>
+        <w:tabs>
+          <w:tab w:val="left" w:pos="916"/>
+          <w:tab w:val="left" w:pos="1832"/>
+          <w:tab w:val="left" w:pos="2748"/>
+          <w:tab w:val="left" w:pos="3664"/>
+          <w:tab w:val="left" w:pos="4580"/>
+          <w:tab w:val="left" w:pos="5496"/>
+          <w:tab w:val="left" w:pos="6412"/>
+          <w:tab w:val="left" w:pos="7328"/>
+          <w:tab w:val="left" w:pos="8244"/>
+          <w:tab w:val="left" w:pos="9160"/>
+          <w:tab w:val="left" w:pos="10076"/>
+          <w:tab w:val="left" w:pos="10992"/>
+          <w:tab w:val="left" w:pos="11908"/>
+          <w:tab w:val="left" w:pos="12824"/>
+          <w:tab w:val="left" w:pos="13740"/>
+          <w:tab w:val="left" w:pos="14656"/>
+        </w:tabs>
+        <w:wordWrap w:val="0"/>
+        <w:spacing w:line="330" w:lineRule="atLeast"/>
+        <w:rPr>
+          <w:rFonts w:ascii="Consolas" w:eastAsia="Times New Roman" w:hAnsi="Consolas" w:cs="Courier New"/>
+          <w:color w:val="0F1115"/>
+          <w:sz w:val="20"/>
+          <w:szCs w:val="20"/>
+          <w:lang w:val="en-GB" w:eastAsia="it-IT"/>
+        </w:rPr>
+      </w:pPr>
+      <w:r>
+        <w:rPr>
+          <w:rFonts w:ascii="Consolas" w:eastAsia="Times New Roman" w:hAnsi="Consolas" w:cs="Courier New"/>
+          <w:color w:val="A626A4"/>
+          <w:sz w:val="20"/>
+          <w:szCs w:val="20"/>
+          <w:lang w:val="en-GB" w:eastAsia="it-IT"/>
+        </w:rPr>
+        <w:t>pause</w:t>
+      </w:r>
+    </w:p>
+    <w:p>
+      <w:pPr>
+        <w:numPr>
+          <w:ilvl w:val="0"/>
+          <w:numId w:val="11"/>
+        </w:numPr>
+        <w:shd w:val="clear" w:color="auto" w:fill="FFFFFF"/>
+        <w:spacing w:before="100" w:beforeAutospacing="1" w:after="0" w:line="240" w:lineRule="auto"/>
+        <w:ind w:left="0"/>
+        <w:rPr>
+          <w:rFonts w:ascii="Segoe UI" w:eastAsia="Times New Roman" w:hAnsi="Segoe UI" w:cs="Segoe UI"/>
+          <w:color w:val="0F1115"/>
+          <w:sz w:val="24"/>
+          <w:szCs w:val="24"/>
+          <w:lang w:eastAsia="it-IT"/>
+        </w:rPr>
+      </w:pPr>
+      <w:r>
+        <w:rPr>
+          <w:rFonts w:ascii="Segoe UI" w:eastAsia="Times New Roman" w:hAnsi="Segoe UI" w:cs="Segoe UI"/>
+          <w:color w:val="0F1115"/>
+          <w:sz w:val="24"/>
+          <w:szCs w:val="24"/>
+          <w:lang w:eastAsia="it-IT"/>
+        </w:rPr>
+        <w:lastRenderedPageBreak/>
+        <w:t>Includilo con l'</w:t>
+      </w:r>
+      <w:proofErr w:type="spellStart"/>
+      <w:r>
+        <w:rPr>
+          <w:rFonts w:ascii="Segoe UI" w:eastAsia="Times New Roman" w:hAnsi="Segoe UI" w:cs="Segoe UI"/>
+          <w:color w:val="0F1115"/>
+          <w:sz w:val="24"/>
+          <w:szCs w:val="24"/>
+          <w:lang w:eastAsia="it-IT"/>
+        </w:rPr>
+        <w:t>app</w:t>
+      </w:r>
+      <w:proofErr w:type="spellEnd"/>
+      <w:r>
+        <w:rPr>
+          <w:rFonts w:ascii="Segoe UI" w:eastAsia="Times New Roman" w:hAnsi="Segoe UI" w:cs="Segoe UI"/>
+          <w:color w:val="0F1115"/>
+          <w:sz w:val="24"/>
+          <w:szCs w:val="24"/>
+          <w:lang w:eastAsia="it-IT"/>
+        </w:rPr>
+        <w:t xml:space="preserve"> e chiedi all'utente di eseguirlo prima di avviare l'applicazione.</w:t>
+      </w:r>
+    </w:p>
+    <w:p>
+      <w:pPr>
+        <w:shd w:val="clear" w:color="auto" w:fill="FFFFFF"/>
+        <w:spacing w:before="480" w:after="240" w:line="480" w:lineRule="atLeast"/>
+        <w:outlineLvl w:val="1"/>
+        <w:rPr>
+          <w:rFonts w:ascii="Segoe UI" w:eastAsia="Times New Roman" w:hAnsi="Segoe UI" w:cs="Segoe UI"/>
+          <w:b/>
+          <w:bCs/>
+          <w:color w:val="0F1115"/>
+          <w:sz w:val="33"/>
+          <w:szCs w:val="33"/>
+          <w:lang w:eastAsia="it-IT"/>
+        </w:rPr>
+      </w:pPr>
+      <w:r>
+        <w:rPr>
+          <w:rFonts w:ascii="Segoe UI" w:eastAsia="Times New Roman" w:hAnsi="Segoe UI" w:cs="Segoe UI"/>
+          <w:b/>
+          <w:bCs/>
+          <w:color w:val="0F1115"/>
+          <w:sz w:val="33"/>
+          <w:szCs w:val="33"/>
+          <w:lang w:eastAsia="it-IT"/>
+        </w:rPr>
+        <w:t>Prevenzione futura:</w:t>
+      </w:r>
+    </w:p>
+    <w:p>
+      <w:pPr>
+        <w:numPr>
+          <w:ilvl w:val="0"/>
+          <w:numId w:val="12"/>
+        </w:numPr>
+        <w:shd w:val="clear" w:color="auto" w:fill="FFFFFF"/>
+        <w:spacing w:before="100" w:beforeAutospacing="1" w:after="0" w:line="240" w:lineRule="auto"/>
+        <w:ind w:left="0"/>
+        <w:rPr>
+          <w:rFonts w:ascii="Segoe UI" w:eastAsia="Times New Roman" w:hAnsi="Segoe UI" w:cs="Segoe UI"/>
+          <w:color w:val="0F1115"/>
+          <w:sz w:val="24"/>
+          <w:szCs w:val="24"/>
+          <w:lang w:eastAsia="it-IT"/>
+        </w:rPr>
+      </w:pPr>
+      <w:r>
+        <w:rPr>
+          <w:rFonts w:ascii="Segoe UI" w:eastAsia="Times New Roman" w:hAnsi="Segoe UI" w:cs="Segoe UI"/>
+          <w:b/>
+          <w:bCs/>
+          <w:color w:val="0F1115"/>
+          <w:sz w:val="24"/>
+          <w:szCs w:val="24"/>
+          <w:lang w:eastAsia="it-IT"/>
+        </w:rPr>
+        <w:t>Nel tuo README</w:t>
+      </w:r>
+      <w:r>
+        <w:rPr>
+          <w:rFonts w:ascii="Segoe UI" w:eastAsia="Times New Roman" w:hAnsi="Segoe UI" w:cs="Segoe UI"/>
+          <w:color w:val="0F1115"/>
+          <w:sz w:val="24"/>
+          <w:szCs w:val="24"/>
+          <w:lang w:eastAsia="it-IT"/>
+        </w:rPr>
+        <w:t> aggiungi i requisiti di sistema</w:t>
+      </w:r>
+    </w:p>
+    <w:p>
+      <w:pPr>
+        <w:numPr>
+          <w:ilvl w:val="0"/>
+          <w:numId w:val="12"/>
+        </w:numPr>
+        <w:shd w:val="clear" w:color="auto" w:fill="FFFFFF"/>
+        <w:spacing w:before="100" w:beforeAutospacing="1" w:after="0" w:line="240" w:lineRule="auto"/>
+        <w:ind w:left="0"/>
+        <w:rPr>
+          <w:rFonts w:ascii="Segoe UI" w:eastAsia="Times New Roman" w:hAnsi="Segoe UI" w:cs="Segoe UI"/>
+          <w:color w:val="0F1115"/>
+          <w:sz w:val="24"/>
+          <w:szCs w:val="24"/>
+          <w:lang w:eastAsia="it-IT"/>
+        </w:rPr>
+      </w:pPr>
+      <w:r>
+        <w:rPr>
+          <w:rFonts w:ascii="Segoe UI" w:eastAsia="Times New Roman" w:hAnsi="Segoe UI" w:cs="Segoe UI"/>
+          <w:b/>
+          <w:bCs/>
+          <w:color w:val="0F1115"/>
+          <w:sz w:val="24"/>
+          <w:szCs w:val="24"/>
+          <w:lang w:eastAsia="it-IT"/>
+        </w:rPr>
+        <w:t>Nella schermata di installazione</w:t>
+      </w:r>
+      <w:r>
+        <w:rPr>
+          <w:rFonts w:ascii="Segoe UI" w:eastAsia="Times New Roman" w:hAnsi="Segoe UI" w:cs="Segoe UI"/>
+          <w:color w:val="0F1115"/>
+          <w:sz w:val="24"/>
+          <w:szCs w:val="24"/>
+          <w:lang w:eastAsia="it-IT"/>
+        </w:rPr>
+        <w:t xml:space="preserve"> verifica la presenza dei </w:t>
+      </w:r>
+      <w:proofErr w:type="spellStart"/>
+      <w:r>
+        <w:rPr>
+          <w:rFonts w:ascii="Segoe UI" w:eastAsia="Times New Roman" w:hAnsi="Segoe UI" w:cs="Segoe UI"/>
+          <w:color w:val="0F1115"/>
+          <w:sz w:val="24"/>
+          <w:szCs w:val="24"/>
+          <w:lang w:eastAsia="it-IT"/>
+        </w:rPr>
+        <w:t>runtime</w:t>
+      </w:r>
+      <w:proofErr w:type="spellEnd"/>
+    </w:p>
+    <w:p>
+      <w:pPr>
+        <w:numPr>
+          <w:ilvl w:val="0"/>
+          <w:numId w:val="12"/>
+        </w:numPr>
+        <w:shd w:val="clear" w:color="auto" w:fill="FFFFFF"/>
+        <w:spacing w:before="100" w:beforeAutospacing="1" w:after="0" w:line="240" w:lineRule="auto"/>
+        <w:ind w:left="0"/>
+        <w:rPr>
+          <w:rFonts w:ascii="Segoe UI" w:eastAsia="Times New Roman" w:hAnsi="Segoe UI" w:cs="Segoe UI"/>
+          <w:color w:val="0F1115"/>
+          <w:sz w:val="24"/>
+          <w:szCs w:val="24"/>
+          <w:lang w:eastAsia="it-IT"/>
+        </w:rPr>
+      </w:pPr>
+      <w:r>
+        <w:rPr>
+          <w:rFonts w:ascii="Segoe UI" w:eastAsia="Times New Roman" w:hAnsi="Segoe UI" w:cs="Segoe UI"/>
+          <w:b/>
+          <w:bCs/>
+          <w:color w:val="0F1115"/>
+          <w:sz w:val="24"/>
+          <w:szCs w:val="24"/>
+          <w:lang w:eastAsia="it-IT"/>
+        </w:rPr>
+        <w:t>Considera Java Web Start</w:t>
+      </w:r>
+      <w:r>
+        <w:rPr>
+          <w:rFonts w:ascii="Segoe UI" w:eastAsia="Times New Roman" w:hAnsi="Segoe UI" w:cs="Segoe UI"/>
+          <w:color w:val="0F1115"/>
+          <w:sz w:val="24"/>
+          <w:szCs w:val="24"/>
+          <w:lang w:eastAsia="it-IT"/>
+        </w:rPr>
+        <w:t> o </w:t>
+      </w:r>
+      <w:proofErr w:type="spellStart"/>
+      <w:r>
+        <w:rPr>
+          <w:rFonts w:ascii="Segoe UI" w:eastAsia="Times New Roman" w:hAnsi="Segoe UI" w:cs="Segoe UI"/>
+          <w:b/>
+          <w:bCs/>
+          <w:color w:val="0F1115"/>
+          <w:sz w:val="24"/>
+          <w:szCs w:val="24"/>
+          <w:lang w:eastAsia="it-IT"/>
+        </w:rPr>
+        <w:t>jpackage</w:t>
+      </w:r>
+      <w:proofErr w:type="spellEnd"/>
+      <w:r>
+        <w:rPr>
+          <w:rFonts w:ascii="Segoe UI" w:eastAsia="Times New Roman" w:hAnsi="Segoe UI" w:cs="Segoe UI"/>
+          <w:color w:val="0F1115"/>
+          <w:sz w:val="24"/>
+          <w:szCs w:val="24"/>
+          <w:lang w:eastAsia="it-IT"/>
+        </w:rPr>
+        <w:t> per applicazioni Java desktop</w:t>
+      </w:r>
+    </w:p>
+    <w:p>
+      <w:pPr>
+        <w:shd w:val="clear" w:color="auto" w:fill="FFFFFF"/>
+        <w:spacing w:before="240" w:after="100" w:afterAutospacing="1" w:line="240" w:lineRule="auto"/>
+        <w:rPr>
+          <w:rFonts w:ascii="Segoe UI" w:eastAsia="Times New Roman" w:hAnsi="Segoe UI" w:cs="Segoe UI"/>
+          <w:color w:val="0F1115"/>
+          <w:sz w:val="24"/>
+          <w:szCs w:val="24"/>
+          <w:lang w:eastAsia="it-IT"/>
+        </w:rPr>
+      </w:pPr>
+      <w:r>
+        <w:rPr>
+          <w:rFonts w:ascii="Segoe UI" w:eastAsia="Times New Roman" w:hAnsi="Segoe UI" w:cs="Segoe UI"/>
+          <w:color w:val="0F1115"/>
+          <w:sz w:val="24"/>
+          <w:szCs w:val="24"/>
+          <w:lang w:eastAsia="it-IT"/>
+        </w:rPr>
+        <w:t>La </w:t>
+      </w:r>
+      <w:r>
+        <w:rPr>
+          <w:rFonts w:ascii="Segoe UI" w:eastAsia="Times New Roman" w:hAnsi="Segoe UI" w:cs="Segoe UI"/>
+          <w:b/>
+          <w:bCs/>
+          <w:color w:val="0F1115"/>
+          <w:sz w:val="24"/>
+          <w:szCs w:val="24"/>
+          <w:lang w:eastAsia="it-IT"/>
+        </w:rPr>
+        <w:t>Soluzione 1</w:t>
+      </w:r>
+      <w:r>
+        <w:rPr>
+          <w:rFonts w:ascii="Segoe UI" w:eastAsia="Times New Roman" w:hAnsi="Segoe UI" w:cs="Segoe UI"/>
+          <w:color w:val="0F1115"/>
+          <w:sz w:val="24"/>
+          <w:szCs w:val="24"/>
+          <w:lang w:eastAsia="it-IT"/>
+        </w:rPr>
+        <w:t xml:space="preserve"> è quella più pulita e professionale, in quanto installa i componenti a livello di sistema una volta per </w:t>
+      </w:r>
+      <w:proofErr w:type="spellStart"/>
+      <w:r>
+        <w:rPr>
+          <w:rFonts w:ascii="Segoe UI" w:eastAsia="Times New Roman" w:hAnsi="Segoe UI" w:cs="Segoe UI"/>
+          <w:color w:val="0F1115"/>
+          <w:sz w:val="24"/>
+          <w:szCs w:val="24"/>
+          <w:lang w:eastAsia="it-IT"/>
+        </w:rPr>
+        <w:t>tutt</w:t>
+      </w:r>
+      <w:proofErr w:type="spellEnd"/>
+    </w:p>
     <w:p/>
     <w:sectPr>
       <w:pgSz w:w="11906" w:h="16838"/>
@@ -6070,9 +9199,9 @@
 <file path=word/numbering.xml><?xml version="1.0" encoding="utf-8"?>
 <w:numbering xmlns:wpc="http://schemas.microsoft.com/office/word/2010/wordprocessingCanvas" xmlns:cx="http://schemas.microsoft.com/office/drawing/2014/chartex" xmlns:mc="http://schemas.openxmlformats.org/markup-compatibility/2006" xmlns:o="urn:schemas-microsoft-com:office:office" xmlns:r="http://schemas.openxmlformats.org/officeDocument/2006/relationships" xmlns:m="http://schemas.openxmlformats.org/officeDocument/2006/math" xmlns:v="urn:schemas-microsoft-com:vml" xmlns:wp14="http://schemas.microsoft.com/office/word/2010/wordprocessingDrawing" xmlns:wp="http://schemas.openxmlformats.org/drawingml/2006/wordprocessingDrawing" xmlns:w10="urn:schemas-microsoft-com:office:word" xmlns:w="http://schemas.openxmlformats.org/wordprocessingml/2006/main" xmlns:w14="http://schemas.microsoft.com/office/word/2010/wordml" xmlns:w15="http://schemas.microsoft.com/office/word/2012/wordml" xmlns:w16se="http://schemas.microsoft.com/office/word/2015/wordml/symex" xmlns:wpg="http://schemas.microsoft.com/office/word/2010/wordprocessingGroup" xmlns:wpi="http://schemas.microsoft.com/office/word/2010/wordprocessingInk" xmlns:wne="http://schemas.microsoft.com/office/word/2006/wordml" xmlns:wps="http://schemas.microsoft.com/office/word/2010/wordprocessingShape" mc:Ignorable="w14 w15 w16se wp14">
   <w:abstractNum w:abstractNumId="0" w15:restartNumberingAfterBreak="0">
-    <w:nsid w:val="19503B43"/>
+    <w:nsid w:val="0D1D405C"/>
     <w:multiLevelType w:val="multilevel"/>
-    <w:tmpl w:val="7B0AA496"/>
+    <w:tmpl w:val="B7E428EE"/>
     <w:lvl w:ilvl="0">
       <w:start w:val="1"/>
       <w:numFmt w:val="bullet"/>
@@ -6219,6 +9348,272 @@
     </w:lvl>
   </w:abstractNum>
   <w:abstractNum w:abstractNumId="1" w15:restartNumberingAfterBreak="0">
+    <w:nsid w:val="19503B43"/>
+    <w:multiLevelType w:val="multilevel"/>
+    <w:tmpl w:val="7B0AA496"/>
+    <w:lvl w:ilvl="0">
+      <w:start w:val="1"/>
+      <w:numFmt w:val="bullet"/>
+      <w:lvlText w:val=""/>
+      <w:lvlJc w:val="left"/>
+      <w:pPr>
+        <w:tabs>
+          <w:tab w:val="num" w:pos="720"/>
+        </w:tabs>
+        <w:ind w:left="720" w:hanging="360"/>
+      </w:pPr>
+      <w:rPr>
+        <w:rFonts w:ascii="Symbol" w:hAnsi="Symbol" w:hint="default"/>
+        <w:sz w:val="20"/>
+      </w:rPr>
+    </w:lvl>
+    <w:lvl w:ilvl="1" w:tentative="1">
+      <w:start w:val="1"/>
+      <w:numFmt w:val="bullet"/>
+      <w:lvlText w:val="o"/>
+      <w:lvlJc w:val="left"/>
+      <w:pPr>
+        <w:tabs>
+          <w:tab w:val="num" w:pos="1440"/>
+        </w:tabs>
+        <w:ind w:left="1440" w:hanging="360"/>
+      </w:pPr>
+      <w:rPr>
+        <w:rFonts w:ascii="Courier New" w:hAnsi="Courier New" w:hint="default"/>
+        <w:sz w:val="20"/>
+      </w:rPr>
+    </w:lvl>
+    <w:lvl w:ilvl="2" w:tentative="1">
+      <w:start w:val="1"/>
+      <w:numFmt w:val="bullet"/>
+      <w:lvlText w:val=""/>
+      <w:lvlJc w:val="left"/>
+      <w:pPr>
+        <w:tabs>
+          <w:tab w:val="num" w:pos="2160"/>
+        </w:tabs>
+        <w:ind w:left="2160" w:hanging="360"/>
+      </w:pPr>
+      <w:rPr>
+        <w:rFonts w:ascii="Wingdings" w:hAnsi="Wingdings" w:hint="default"/>
+        <w:sz w:val="20"/>
+      </w:rPr>
+    </w:lvl>
+    <w:lvl w:ilvl="3" w:tentative="1">
+      <w:start w:val="1"/>
+      <w:numFmt w:val="bullet"/>
+      <w:lvlText w:val=""/>
+      <w:lvlJc w:val="left"/>
+      <w:pPr>
+        <w:tabs>
+          <w:tab w:val="num" w:pos="2880"/>
+        </w:tabs>
+        <w:ind w:left="2880" w:hanging="360"/>
+      </w:pPr>
+      <w:rPr>
+        <w:rFonts w:ascii="Wingdings" w:hAnsi="Wingdings" w:hint="default"/>
+        <w:sz w:val="20"/>
+      </w:rPr>
+    </w:lvl>
+    <w:lvl w:ilvl="4" w:tentative="1">
+      <w:start w:val="1"/>
+      <w:numFmt w:val="bullet"/>
+      <w:lvlText w:val=""/>
+      <w:lvlJc w:val="left"/>
+      <w:pPr>
+        <w:tabs>
+          <w:tab w:val="num" w:pos="3600"/>
+        </w:tabs>
+        <w:ind w:left="3600" w:hanging="360"/>
+      </w:pPr>
+      <w:rPr>
+        <w:rFonts w:ascii="Wingdings" w:hAnsi="Wingdings" w:hint="default"/>
+        <w:sz w:val="20"/>
+      </w:rPr>
+    </w:lvl>
+    <w:lvl w:ilvl="5" w:tentative="1">
+      <w:start w:val="1"/>
+      <w:numFmt w:val="bullet"/>
+      <w:lvlText w:val=""/>
+      <w:lvlJc w:val="left"/>
+      <w:pPr>
+        <w:tabs>
+          <w:tab w:val="num" w:pos="4320"/>
+        </w:tabs>
+        <w:ind w:left="4320" w:hanging="360"/>
+      </w:pPr>
+      <w:rPr>
+        <w:rFonts w:ascii="Wingdings" w:hAnsi="Wingdings" w:hint="default"/>
+        <w:sz w:val="20"/>
+      </w:rPr>
+    </w:lvl>
+    <w:lvl w:ilvl="6" w:tentative="1">
+      <w:start w:val="1"/>
+      <w:numFmt w:val="bullet"/>
+      <w:lvlText w:val=""/>
+      <w:lvlJc w:val="left"/>
+      <w:pPr>
+        <w:tabs>
+          <w:tab w:val="num" w:pos="5040"/>
+        </w:tabs>
+        <w:ind w:left="5040" w:hanging="360"/>
+      </w:pPr>
+      <w:rPr>
+        <w:rFonts w:ascii="Wingdings" w:hAnsi="Wingdings" w:hint="default"/>
+        <w:sz w:val="20"/>
+      </w:rPr>
+    </w:lvl>
+    <w:lvl w:ilvl="7" w:tentative="1">
+      <w:start w:val="1"/>
+      <w:numFmt w:val="bullet"/>
+      <w:lvlText w:val=""/>
+      <w:lvlJc w:val="left"/>
+      <w:pPr>
+        <w:tabs>
+          <w:tab w:val="num" w:pos="5760"/>
+        </w:tabs>
+        <w:ind w:left="5760" w:hanging="360"/>
+      </w:pPr>
+      <w:rPr>
+        <w:rFonts w:ascii="Wingdings" w:hAnsi="Wingdings" w:hint="default"/>
+        <w:sz w:val="20"/>
+      </w:rPr>
+    </w:lvl>
+    <w:lvl w:ilvl="8" w:tentative="1">
+      <w:start w:val="1"/>
+      <w:numFmt w:val="bullet"/>
+      <w:lvlText w:val=""/>
+      <w:lvlJc w:val="left"/>
+      <w:pPr>
+        <w:tabs>
+          <w:tab w:val="num" w:pos="6480"/>
+        </w:tabs>
+        <w:ind w:left="6480" w:hanging="360"/>
+      </w:pPr>
+      <w:rPr>
+        <w:rFonts w:ascii="Wingdings" w:hAnsi="Wingdings" w:hint="default"/>
+        <w:sz w:val="20"/>
+      </w:rPr>
+    </w:lvl>
+  </w:abstractNum>
+  <w:abstractNum w:abstractNumId="2" w15:restartNumberingAfterBreak="0">
+    <w:nsid w:val="20267E47"/>
+    <w:multiLevelType w:val="multilevel"/>
+    <w:tmpl w:val="6E0A1862"/>
+    <w:lvl w:ilvl="0">
+      <w:start w:val="1"/>
+      <w:numFmt w:val="decimal"/>
+      <w:lvlText w:val="%1."/>
+      <w:lvlJc w:val="left"/>
+      <w:pPr>
+        <w:tabs>
+          <w:tab w:val="num" w:pos="720"/>
+        </w:tabs>
+        <w:ind w:left="720" w:hanging="360"/>
+      </w:pPr>
+    </w:lvl>
+    <w:lvl w:ilvl="1">
+      <w:start w:val="1"/>
+      <w:numFmt w:val="bullet"/>
+      <w:lvlText w:val="o"/>
+      <w:lvlJc w:val="left"/>
+      <w:pPr>
+        <w:tabs>
+          <w:tab w:val="num" w:pos="1440"/>
+        </w:tabs>
+        <w:ind w:left="1440" w:hanging="360"/>
+      </w:pPr>
+      <w:rPr>
+        <w:rFonts w:ascii="Courier New" w:hAnsi="Courier New" w:hint="default"/>
+        <w:sz w:val="20"/>
+      </w:rPr>
+    </w:lvl>
+    <w:lvl w:ilvl="2" w:tentative="1">
+      <w:start w:val="1"/>
+      <w:numFmt w:val="decimal"/>
+      <w:lvlText w:val="%3."/>
+      <w:lvlJc w:val="left"/>
+      <w:pPr>
+        <w:tabs>
+          <w:tab w:val="num" w:pos="2160"/>
+        </w:tabs>
+        <w:ind w:left="2160" w:hanging="360"/>
+      </w:pPr>
+    </w:lvl>
+    <w:lvl w:ilvl="3" w:tentative="1">
+      <w:start w:val="1"/>
+      <w:numFmt w:val="decimal"/>
+      <w:lvlText w:val="%4."/>
+      <w:lvlJc w:val="left"/>
+      <w:pPr>
+        <w:tabs>
+          <w:tab w:val="num" w:pos="2880"/>
+        </w:tabs>
+        <w:ind w:left="2880" w:hanging="360"/>
+      </w:pPr>
+    </w:lvl>
+    <w:lvl w:ilvl="4" w:tentative="1">
+      <w:start w:val="1"/>
+      <w:numFmt w:val="decimal"/>
+      <w:lvlText w:val="%5."/>
+      <w:lvlJc w:val="left"/>
+      <w:pPr>
+        <w:tabs>
+          <w:tab w:val="num" w:pos="3600"/>
+        </w:tabs>
+        <w:ind w:left="3600" w:hanging="360"/>
+      </w:pPr>
+    </w:lvl>
+    <w:lvl w:ilvl="5" w:tentative="1">
+      <w:start w:val="1"/>
+      <w:numFmt w:val="decimal"/>
+      <w:lvlText w:val="%6."/>
+      <w:lvlJc w:val="left"/>
+      <w:pPr>
+        <w:tabs>
+          <w:tab w:val="num" w:pos="4320"/>
+        </w:tabs>
+        <w:ind w:left="4320" w:hanging="360"/>
+      </w:pPr>
+    </w:lvl>
+    <w:lvl w:ilvl="6" w:tentative="1">
+      <w:start w:val="1"/>
+      <w:numFmt w:val="decimal"/>
+      <w:lvlText w:val="%7."/>
+      <w:lvlJc w:val="left"/>
+      <w:pPr>
+        <w:tabs>
+          <w:tab w:val="num" w:pos="5040"/>
+        </w:tabs>
+        <w:ind w:left="5040" w:hanging="360"/>
+      </w:pPr>
+    </w:lvl>
+    <w:lvl w:ilvl="7" w:tentative="1">
+      <w:start w:val="1"/>
+      <w:numFmt w:val="decimal"/>
+      <w:lvlText w:val="%8."/>
+      <w:lvlJc w:val="left"/>
+      <w:pPr>
+        <w:tabs>
+          <w:tab w:val="num" w:pos="5760"/>
+        </w:tabs>
+        <w:ind w:left="5760" w:hanging="360"/>
+      </w:pPr>
+    </w:lvl>
+    <w:lvl w:ilvl="8" w:tentative="1">
+      <w:start w:val="1"/>
+      <w:numFmt w:val="decimal"/>
+      <w:lvlText w:val="%9."/>
+      <w:lvlJc w:val="left"/>
+      <w:pPr>
+        <w:tabs>
+          <w:tab w:val="num" w:pos="6480"/>
+        </w:tabs>
+        <w:ind w:left="6480" w:hanging="360"/>
+      </w:pPr>
+    </w:lvl>
+  </w:abstractNum>
+  <w:abstractNum w:abstractNumId="3" w15:restartNumberingAfterBreak="0">
     <w:nsid w:val="30F90654"/>
     <w:multiLevelType w:val="multilevel"/>
     <w:tmpl w:val="F80A5B6C"/>
@@ -6331,7 +9726,7 @@
       </w:pPr>
     </w:lvl>
   </w:abstractNum>
-  <w:abstractNum w:abstractNumId="2" w15:restartNumberingAfterBreak="0">
+  <w:abstractNum w:abstractNumId="4" w15:restartNumberingAfterBreak="0">
     <w:nsid w:val="47512F5B"/>
     <w:multiLevelType w:val="multilevel"/>
     <w:tmpl w:val="EC46D6BC"/>
@@ -6444,7 +9839,616 @@
       </w:pPr>
     </w:lvl>
   </w:abstractNum>
-  <w:abstractNum w:abstractNumId="3" w15:restartNumberingAfterBreak="0">
+  <w:abstractNum w:abstractNumId="5" w15:restartNumberingAfterBreak="0">
+    <w:nsid w:val="4B49655C"/>
+    <w:multiLevelType w:val="multilevel"/>
+    <w:tmpl w:val="75B627CC"/>
+    <w:lvl w:ilvl="0">
+      <w:start w:val="1"/>
+      <w:numFmt w:val="decimal"/>
+      <w:lvlText w:val="%1."/>
+      <w:lvlJc w:val="left"/>
+      <w:pPr>
+        <w:tabs>
+          <w:tab w:val="num" w:pos="720"/>
+        </w:tabs>
+        <w:ind w:left="720" w:hanging="360"/>
+      </w:pPr>
+    </w:lvl>
+    <w:lvl w:ilvl="1">
+      <w:start w:val="1"/>
+      <w:numFmt w:val="bullet"/>
+      <w:lvlText w:val="o"/>
+      <w:lvlJc w:val="left"/>
+      <w:pPr>
+        <w:tabs>
+          <w:tab w:val="num" w:pos="1440"/>
+        </w:tabs>
+        <w:ind w:left="1440" w:hanging="360"/>
+      </w:pPr>
+      <w:rPr>
+        <w:rFonts w:ascii="Courier New" w:hAnsi="Courier New" w:hint="default"/>
+        <w:sz w:val="20"/>
+      </w:rPr>
+    </w:lvl>
+    <w:lvl w:ilvl="2" w:tentative="1">
+      <w:start w:val="1"/>
+      <w:numFmt w:val="decimal"/>
+      <w:lvlText w:val="%3."/>
+      <w:lvlJc w:val="left"/>
+      <w:pPr>
+        <w:tabs>
+          <w:tab w:val="num" w:pos="2160"/>
+        </w:tabs>
+        <w:ind w:left="2160" w:hanging="360"/>
+      </w:pPr>
+    </w:lvl>
+    <w:lvl w:ilvl="3" w:tentative="1">
+      <w:start w:val="1"/>
+      <w:numFmt w:val="decimal"/>
+      <w:lvlText w:val="%4."/>
+      <w:lvlJc w:val="left"/>
+      <w:pPr>
+        <w:tabs>
+          <w:tab w:val="num" w:pos="2880"/>
+        </w:tabs>
+        <w:ind w:left="2880" w:hanging="360"/>
+      </w:pPr>
+    </w:lvl>
+    <w:lvl w:ilvl="4" w:tentative="1">
+      <w:start w:val="1"/>
+      <w:numFmt w:val="decimal"/>
+      <w:lvlText w:val="%5."/>
+      <w:lvlJc w:val="left"/>
+      <w:pPr>
+        <w:tabs>
+          <w:tab w:val="num" w:pos="3600"/>
+        </w:tabs>
+        <w:ind w:left="3600" w:hanging="360"/>
+      </w:pPr>
+    </w:lvl>
+    <w:lvl w:ilvl="5" w:tentative="1">
+      <w:start w:val="1"/>
+      <w:numFmt w:val="decimal"/>
+      <w:lvlText w:val="%6."/>
+      <w:lvlJc w:val="left"/>
+      <w:pPr>
+        <w:tabs>
+          <w:tab w:val="num" w:pos="4320"/>
+        </w:tabs>
+        <w:ind w:left="4320" w:hanging="360"/>
+      </w:pPr>
+    </w:lvl>
+    <w:lvl w:ilvl="6" w:tentative="1">
+      <w:start w:val="1"/>
+      <w:numFmt w:val="decimal"/>
+      <w:lvlText w:val="%7."/>
+      <w:lvlJc w:val="left"/>
+      <w:pPr>
+        <w:tabs>
+          <w:tab w:val="num" w:pos="5040"/>
+        </w:tabs>
+        <w:ind w:left="5040" w:hanging="360"/>
+      </w:pPr>
+    </w:lvl>
+    <w:lvl w:ilvl="7" w:tentative="1">
+      <w:start w:val="1"/>
+      <w:numFmt w:val="decimal"/>
+      <w:lvlText w:val="%8."/>
+      <w:lvlJc w:val="left"/>
+      <w:pPr>
+        <w:tabs>
+          <w:tab w:val="num" w:pos="5760"/>
+        </w:tabs>
+        <w:ind w:left="5760" w:hanging="360"/>
+      </w:pPr>
+    </w:lvl>
+    <w:lvl w:ilvl="8" w:tentative="1">
+      <w:start w:val="1"/>
+      <w:numFmt w:val="decimal"/>
+      <w:lvlText w:val="%9."/>
+      <w:lvlJc w:val="left"/>
+      <w:pPr>
+        <w:tabs>
+          <w:tab w:val="num" w:pos="6480"/>
+        </w:tabs>
+        <w:ind w:left="6480" w:hanging="360"/>
+      </w:pPr>
+    </w:lvl>
+  </w:abstractNum>
+  <w:abstractNum w:abstractNumId="6" w15:restartNumberingAfterBreak="0">
+    <w:nsid w:val="56C343AD"/>
+    <w:multiLevelType w:val="multilevel"/>
+    <w:tmpl w:val="E842C96E"/>
+    <w:lvl w:ilvl="0">
+      <w:start w:val="1"/>
+      <w:numFmt w:val="decimal"/>
+      <w:lvlText w:val="%1."/>
+      <w:lvlJc w:val="left"/>
+      <w:pPr>
+        <w:tabs>
+          <w:tab w:val="num" w:pos="720"/>
+        </w:tabs>
+        <w:ind w:left="720" w:hanging="360"/>
+      </w:pPr>
+    </w:lvl>
+    <w:lvl w:ilvl="1" w:tentative="1">
+      <w:start w:val="1"/>
+      <w:numFmt w:val="decimal"/>
+      <w:lvlText w:val="%2."/>
+      <w:lvlJc w:val="left"/>
+      <w:pPr>
+        <w:tabs>
+          <w:tab w:val="num" w:pos="1440"/>
+        </w:tabs>
+        <w:ind w:left="1440" w:hanging="360"/>
+      </w:pPr>
+    </w:lvl>
+    <w:lvl w:ilvl="2" w:tentative="1">
+      <w:start w:val="1"/>
+      <w:numFmt w:val="decimal"/>
+      <w:lvlText w:val="%3."/>
+      <w:lvlJc w:val="left"/>
+      <w:pPr>
+        <w:tabs>
+          <w:tab w:val="num" w:pos="2160"/>
+        </w:tabs>
+        <w:ind w:left="2160" w:hanging="360"/>
+      </w:pPr>
+    </w:lvl>
+    <w:lvl w:ilvl="3" w:tentative="1">
+      <w:start w:val="1"/>
+      <w:numFmt w:val="decimal"/>
+      <w:lvlText w:val="%4."/>
+      <w:lvlJc w:val="left"/>
+      <w:pPr>
+        <w:tabs>
+          <w:tab w:val="num" w:pos="2880"/>
+        </w:tabs>
+        <w:ind w:left="2880" w:hanging="360"/>
+      </w:pPr>
+    </w:lvl>
+    <w:lvl w:ilvl="4" w:tentative="1">
+      <w:start w:val="1"/>
+      <w:numFmt w:val="decimal"/>
+      <w:lvlText w:val="%5."/>
+      <w:lvlJc w:val="left"/>
+      <w:pPr>
+        <w:tabs>
+          <w:tab w:val="num" w:pos="3600"/>
+        </w:tabs>
+        <w:ind w:left="3600" w:hanging="360"/>
+      </w:pPr>
+    </w:lvl>
+    <w:lvl w:ilvl="5" w:tentative="1">
+      <w:start w:val="1"/>
+      <w:numFmt w:val="decimal"/>
+      <w:lvlText w:val="%6."/>
+      <w:lvlJc w:val="left"/>
+      <w:pPr>
+        <w:tabs>
+          <w:tab w:val="num" w:pos="4320"/>
+        </w:tabs>
+        <w:ind w:left="4320" w:hanging="360"/>
+      </w:pPr>
+    </w:lvl>
+    <w:lvl w:ilvl="6" w:tentative="1">
+      <w:start w:val="1"/>
+      <w:numFmt w:val="decimal"/>
+      <w:lvlText w:val="%7."/>
+      <w:lvlJc w:val="left"/>
+      <w:pPr>
+        <w:tabs>
+          <w:tab w:val="num" w:pos="5040"/>
+        </w:tabs>
+        <w:ind w:left="5040" w:hanging="360"/>
+      </w:pPr>
+    </w:lvl>
+    <w:lvl w:ilvl="7" w:tentative="1">
+      <w:start w:val="1"/>
+      <w:numFmt w:val="decimal"/>
+      <w:lvlText w:val="%8."/>
+      <w:lvlJc w:val="left"/>
+      <w:pPr>
+        <w:tabs>
+          <w:tab w:val="num" w:pos="5760"/>
+        </w:tabs>
+        <w:ind w:left="5760" w:hanging="360"/>
+      </w:pPr>
+    </w:lvl>
+    <w:lvl w:ilvl="8" w:tentative="1">
+      <w:start w:val="1"/>
+      <w:numFmt w:val="decimal"/>
+      <w:lvlText w:val="%9."/>
+      <w:lvlJc w:val="left"/>
+      <w:pPr>
+        <w:tabs>
+          <w:tab w:val="num" w:pos="6480"/>
+        </w:tabs>
+        <w:ind w:left="6480" w:hanging="360"/>
+      </w:pPr>
+    </w:lvl>
+  </w:abstractNum>
+  <w:abstractNum w:abstractNumId="7" w15:restartNumberingAfterBreak="0">
+    <w:nsid w:val="58933CAF"/>
+    <w:multiLevelType w:val="multilevel"/>
+    <w:tmpl w:val="829C26BC"/>
+    <w:lvl w:ilvl="0">
+      <w:start w:val="1"/>
+      <w:numFmt w:val="bullet"/>
+      <w:lvlText w:val=""/>
+      <w:lvlJc w:val="left"/>
+      <w:pPr>
+        <w:tabs>
+          <w:tab w:val="num" w:pos="720"/>
+        </w:tabs>
+        <w:ind w:left="720" w:hanging="360"/>
+      </w:pPr>
+      <w:rPr>
+        <w:rFonts w:ascii="Symbol" w:hAnsi="Symbol" w:hint="default"/>
+        <w:sz w:val="20"/>
+      </w:rPr>
+    </w:lvl>
+    <w:lvl w:ilvl="1" w:tentative="1">
+      <w:start w:val="1"/>
+      <w:numFmt w:val="bullet"/>
+      <w:lvlText w:val="o"/>
+      <w:lvlJc w:val="left"/>
+      <w:pPr>
+        <w:tabs>
+          <w:tab w:val="num" w:pos="1440"/>
+        </w:tabs>
+        <w:ind w:left="1440" w:hanging="360"/>
+      </w:pPr>
+      <w:rPr>
+        <w:rFonts w:ascii="Courier New" w:hAnsi="Courier New" w:hint="default"/>
+        <w:sz w:val="20"/>
+      </w:rPr>
+    </w:lvl>
+    <w:lvl w:ilvl="2" w:tentative="1">
+      <w:start w:val="1"/>
+      <w:numFmt w:val="bullet"/>
+      <w:lvlText w:val=""/>
+      <w:lvlJc w:val="left"/>
+      <w:pPr>
+        <w:tabs>
+          <w:tab w:val="num" w:pos="2160"/>
+        </w:tabs>
+        <w:ind w:left="2160" w:hanging="360"/>
+      </w:pPr>
+      <w:rPr>
+        <w:rFonts w:ascii="Wingdings" w:hAnsi="Wingdings" w:hint="default"/>
+        <w:sz w:val="20"/>
+      </w:rPr>
+    </w:lvl>
+    <w:lvl w:ilvl="3" w:tentative="1">
+      <w:start w:val="1"/>
+      <w:numFmt w:val="bullet"/>
+      <w:lvlText w:val=""/>
+      <w:lvlJc w:val="left"/>
+      <w:pPr>
+        <w:tabs>
+          <w:tab w:val="num" w:pos="2880"/>
+        </w:tabs>
+        <w:ind w:left="2880" w:hanging="360"/>
+      </w:pPr>
+      <w:rPr>
+        <w:rFonts w:ascii="Wingdings" w:hAnsi="Wingdings" w:hint="default"/>
+        <w:sz w:val="20"/>
+      </w:rPr>
+    </w:lvl>
+    <w:lvl w:ilvl="4" w:tentative="1">
+      <w:start w:val="1"/>
+      <w:numFmt w:val="bullet"/>
+      <w:lvlText w:val=""/>
+      <w:lvlJc w:val="left"/>
+      <w:pPr>
+        <w:tabs>
+          <w:tab w:val="num" w:pos="3600"/>
+        </w:tabs>
+        <w:ind w:left="3600" w:hanging="360"/>
+      </w:pPr>
+      <w:rPr>
+        <w:rFonts w:ascii="Wingdings" w:hAnsi="Wingdings" w:hint="default"/>
+        <w:sz w:val="20"/>
+      </w:rPr>
+    </w:lvl>
+    <w:lvl w:ilvl="5" w:tentative="1">
+      <w:start w:val="1"/>
+      <w:numFmt w:val="bullet"/>
+      <w:lvlText w:val=""/>
+      <w:lvlJc w:val="left"/>
+      <w:pPr>
+        <w:tabs>
+          <w:tab w:val="num" w:pos="4320"/>
+        </w:tabs>
+        <w:ind w:left="4320" w:hanging="360"/>
+      </w:pPr>
+      <w:rPr>
+        <w:rFonts w:ascii="Wingdings" w:hAnsi="Wingdings" w:hint="default"/>
+        <w:sz w:val="20"/>
+      </w:rPr>
+    </w:lvl>
+    <w:lvl w:ilvl="6" w:tentative="1">
+      <w:start w:val="1"/>
+      <w:numFmt w:val="bullet"/>
+      <w:lvlText w:val=""/>
+      <w:lvlJc w:val="left"/>
+      <w:pPr>
+        <w:tabs>
+          <w:tab w:val="num" w:pos="5040"/>
+        </w:tabs>
+        <w:ind w:left="5040" w:hanging="360"/>
+      </w:pPr>
+      <w:rPr>
+        <w:rFonts w:ascii="Wingdings" w:hAnsi="Wingdings" w:hint="default"/>
+        <w:sz w:val="20"/>
+      </w:rPr>
+    </w:lvl>
+    <w:lvl w:ilvl="7" w:tentative="1">
+      <w:start w:val="1"/>
+      <w:numFmt w:val="bullet"/>
+      <w:lvlText w:val=""/>
+      <w:lvlJc w:val="left"/>
+      <w:pPr>
+        <w:tabs>
+          <w:tab w:val="num" w:pos="5760"/>
+        </w:tabs>
+        <w:ind w:left="5760" w:hanging="360"/>
+      </w:pPr>
+      <w:rPr>
+        <w:rFonts w:ascii="Wingdings" w:hAnsi="Wingdings" w:hint="default"/>
+        <w:sz w:val="20"/>
+      </w:rPr>
+    </w:lvl>
+    <w:lvl w:ilvl="8" w:tentative="1">
+      <w:start w:val="1"/>
+      <w:numFmt w:val="bullet"/>
+      <w:lvlText w:val=""/>
+      <w:lvlJc w:val="left"/>
+      <w:pPr>
+        <w:tabs>
+          <w:tab w:val="num" w:pos="6480"/>
+        </w:tabs>
+        <w:ind w:left="6480" w:hanging="360"/>
+      </w:pPr>
+      <w:rPr>
+        <w:rFonts w:ascii="Wingdings" w:hAnsi="Wingdings" w:hint="default"/>
+        <w:sz w:val="20"/>
+      </w:rPr>
+    </w:lvl>
+  </w:abstractNum>
+  <w:abstractNum w:abstractNumId="8" w15:restartNumberingAfterBreak="0">
+    <w:nsid w:val="5B730EB5"/>
+    <w:multiLevelType w:val="multilevel"/>
+    <w:tmpl w:val="EBE8E194"/>
+    <w:lvl w:ilvl="0">
+      <w:start w:val="1"/>
+      <w:numFmt w:val="decimal"/>
+      <w:lvlText w:val="%1."/>
+      <w:lvlJc w:val="left"/>
+      <w:pPr>
+        <w:tabs>
+          <w:tab w:val="num" w:pos="720"/>
+        </w:tabs>
+        <w:ind w:left="720" w:hanging="360"/>
+      </w:pPr>
+    </w:lvl>
+    <w:lvl w:ilvl="1" w:tentative="1">
+      <w:start w:val="1"/>
+      <w:numFmt w:val="decimal"/>
+      <w:lvlText w:val="%2."/>
+      <w:lvlJc w:val="left"/>
+      <w:pPr>
+        <w:tabs>
+          <w:tab w:val="num" w:pos="1440"/>
+        </w:tabs>
+        <w:ind w:left="1440" w:hanging="360"/>
+      </w:pPr>
+    </w:lvl>
+    <w:lvl w:ilvl="2" w:tentative="1">
+      <w:start w:val="1"/>
+      <w:numFmt w:val="decimal"/>
+      <w:lvlText w:val="%3."/>
+      <w:lvlJc w:val="left"/>
+      <w:pPr>
+        <w:tabs>
+          <w:tab w:val="num" w:pos="2160"/>
+        </w:tabs>
+        <w:ind w:left="2160" w:hanging="360"/>
+      </w:pPr>
+    </w:lvl>
+    <w:lvl w:ilvl="3" w:tentative="1">
+      <w:start w:val="1"/>
+      <w:numFmt w:val="decimal"/>
+      <w:lvlText w:val="%4."/>
+      <w:lvlJc w:val="left"/>
+      <w:pPr>
+        <w:tabs>
+          <w:tab w:val="num" w:pos="2880"/>
+        </w:tabs>
+        <w:ind w:left="2880" w:hanging="360"/>
+      </w:pPr>
+    </w:lvl>
+    <w:lvl w:ilvl="4" w:tentative="1">
+      <w:start w:val="1"/>
+      <w:numFmt w:val="decimal"/>
+      <w:lvlText w:val="%5."/>
+      <w:lvlJc w:val="left"/>
+      <w:pPr>
+        <w:tabs>
+          <w:tab w:val="num" w:pos="3600"/>
+        </w:tabs>
+        <w:ind w:left="3600" w:hanging="360"/>
+      </w:pPr>
+    </w:lvl>
+    <w:lvl w:ilvl="5" w:tentative="1">
+      <w:start w:val="1"/>
+      <w:numFmt w:val="decimal"/>
+      <w:lvlText w:val="%6."/>
+      <w:lvlJc w:val="left"/>
+      <w:pPr>
+        <w:tabs>
+          <w:tab w:val="num" w:pos="4320"/>
+        </w:tabs>
+        <w:ind w:left="4320" w:hanging="360"/>
+      </w:pPr>
+    </w:lvl>
+    <w:lvl w:ilvl="6" w:tentative="1">
+      <w:start w:val="1"/>
+      <w:numFmt w:val="decimal"/>
+      <w:lvlText w:val="%7."/>
+      <w:lvlJc w:val="left"/>
+      <w:pPr>
+        <w:tabs>
+          <w:tab w:val="num" w:pos="5040"/>
+        </w:tabs>
+        <w:ind w:left="5040" w:hanging="360"/>
+      </w:pPr>
+    </w:lvl>
+    <w:lvl w:ilvl="7" w:tentative="1">
+      <w:start w:val="1"/>
+      <w:numFmt w:val="decimal"/>
+      <w:lvlText w:val="%8."/>
+      <w:lvlJc w:val="left"/>
+      <w:pPr>
+        <w:tabs>
+          <w:tab w:val="num" w:pos="5760"/>
+        </w:tabs>
+        <w:ind w:left="5760" w:hanging="360"/>
+      </w:pPr>
+    </w:lvl>
+    <w:lvl w:ilvl="8" w:tentative="1">
+      <w:start w:val="1"/>
+      <w:numFmt w:val="decimal"/>
+      <w:lvlText w:val="%9."/>
+      <w:lvlJc w:val="left"/>
+      <w:pPr>
+        <w:tabs>
+          <w:tab w:val="num" w:pos="6480"/>
+        </w:tabs>
+        <w:ind w:left="6480" w:hanging="360"/>
+      </w:pPr>
+    </w:lvl>
+  </w:abstractNum>
+  <w:abstractNum w:abstractNumId="9" w15:restartNumberingAfterBreak="0">
+    <w:nsid w:val="5EB45E1A"/>
+    <w:multiLevelType w:val="multilevel"/>
+    <w:tmpl w:val="B6F67DA0"/>
+    <w:lvl w:ilvl="0">
+      <w:start w:val="1"/>
+      <w:numFmt w:val="decimal"/>
+      <w:lvlText w:val="%1."/>
+      <w:lvlJc w:val="left"/>
+      <w:pPr>
+        <w:tabs>
+          <w:tab w:val="num" w:pos="720"/>
+        </w:tabs>
+        <w:ind w:left="720" w:hanging="360"/>
+      </w:pPr>
+    </w:lvl>
+    <w:lvl w:ilvl="1">
+      <w:start w:val="1"/>
+      <w:numFmt w:val="bullet"/>
+      <w:lvlText w:val="o"/>
+      <w:lvlJc w:val="left"/>
+      <w:pPr>
+        <w:tabs>
+          <w:tab w:val="num" w:pos="1440"/>
+        </w:tabs>
+        <w:ind w:left="1440" w:hanging="360"/>
+      </w:pPr>
+      <w:rPr>
+        <w:rFonts w:ascii="Courier New" w:hAnsi="Courier New" w:hint="default"/>
+        <w:sz w:val="20"/>
+      </w:rPr>
+    </w:lvl>
+    <w:lvl w:ilvl="2" w:tentative="1">
+      <w:start w:val="1"/>
+      <w:numFmt w:val="decimal"/>
+      <w:lvlText w:val="%3."/>
+      <w:lvlJc w:val="left"/>
+      <w:pPr>
+        <w:tabs>
+          <w:tab w:val="num" w:pos="2160"/>
+        </w:tabs>
+        <w:ind w:left="2160" w:hanging="360"/>
+      </w:pPr>
+    </w:lvl>
+    <w:lvl w:ilvl="3" w:tentative="1">
+      <w:start w:val="1"/>
+      <w:numFmt w:val="decimal"/>
+      <w:lvlText w:val="%4."/>
+      <w:lvlJc w:val="left"/>
+      <w:pPr>
+        <w:tabs>
+          <w:tab w:val="num" w:pos="2880"/>
+        </w:tabs>
+        <w:ind w:left="2880" w:hanging="360"/>
+      </w:pPr>
+    </w:lvl>
+    <w:lvl w:ilvl="4" w:tentative="1">
+      <w:start w:val="1"/>
+      <w:numFmt w:val="decimal"/>
+      <w:lvlText w:val="%5."/>
+      <w:lvlJc w:val="left"/>
+      <w:pPr>
+        <w:tabs>
+          <w:tab w:val="num" w:pos="3600"/>
+        </w:tabs>
+        <w:ind w:left="3600" w:hanging="360"/>
+      </w:pPr>
+    </w:lvl>
+    <w:lvl w:ilvl="5" w:tentative="1">
+      <w:start w:val="1"/>
+      <w:numFmt w:val="decimal"/>
+      <w:lvlText w:val="%6."/>
+      <w:lvlJc w:val="left"/>
+      <w:pPr>
+        <w:tabs>
+          <w:tab w:val="num" w:pos="4320"/>
+        </w:tabs>
+        <w:ind w:left="4320" w:hanging="360"/>
+      </w:pPr>
+    </w:lvl>
+    <w:lvl w:ilvl="6" w:tentative="1">
+      <w:start w:val="1"/>
+      <w:numFmt w:val="decimal"/>
+      <w:lvlText w:val="%7."/>
+      <w:lvlJc w:val="left"/>
+      <w:pPr>
+        <w:tabs>
+          <w:tab w:val="num" w:pos="5040"/>
+        </w:tabs>
+        <w:ind w:left="5040" w:hanging="360"/>
+      </w:pPr>
+    </w:lvl>
+    <w:lvl w:ilvl="7" w:tentative="1">
+      <w:start w:val="1"/>
+      <w:numFmt w:val="decimal"/>
+      <w:lvlText w:val="%8."/>
+      <w:lvlJc w:val="left"/>
+      <w:pPr>
+        <w:tabs>
+          <w:tab w:val="num" w:pos="5760"/>
+        </w:tabs>
+        <w:ind w:left="5760" w:hanging="360"/>
+      </w:pPr>
+    </w:lvl>
+    <w:lvl w:ilvl="8" w:tentative="1">
+      <w:start w:val="1"/>
+      <w:numFmt w:val="decimal"/>
+      <w:lvlText w:val="%9."/>
+      <w:lvlJc w:val="left"/>
+      <w:pPr>
+        <w:tabs>
+          <w:tab w:val="num" w:pos="6480"/>
+        </w:tabs>
+        <w:ind w:left="6480" w:hanging="360"/>
+      </w:pPr>
+    </w:lvl>
+  </w:abstractNum>
+  <w:abstractNum w:abstractNumId="10" w15:restartNumberingAfterBreak="0">
     <w:nsid w:val="6E976A1C"/>
     <w:multiLevelType w:val="multilevel"/>
     <w:tmpl w:val="1EDEA23A"/>
@@ -6557,7 +10561,7 @@
       </w:pPr>
     </w:lvl>
   </w:abstractNum>
-  <w:abstractNum w:abstractNumId="4" w15:restartNumberingAfterBreak="0">
+  <w:abstractNum w:abstractNumId="11" w15:restartNumberingAfterBreak="0">
     <w:nsid w:val="7A1C55AF"/>
     <w:multiLevelType w:val="multilevel"/>
     <w:tmpl w:val="A2DC5774"/>
@@ -6671,19 +10675,40 @@
     </w:lvl>
   </w:abstractNum>
   <w:num w:numId="1">
+    <w:abstractNumId w:val="10"/>
+  </w:num>
+  <w:num w:numId="2">
+    <w:abstractNumId w:val="1"/>
+  </w:num>
+  <w:num w:numId="3">
+    <w:abstractNumId w:val="11"/>
+  </w:num>
+  <w:num w:numId="4">
+    <w:abstractNumId w:val="4"/>
+  </w:num>
+  <w:num w:numId="5">
     <w:abstractNumId w:val="3"/>
   </w:num>
-  <w:num w:numId="2">
+  <w:num w:numId="6">
+    <w:abstractNumId w:val="5"/>
+  </w:num>
+  <w:num w:numId="7">
+    <w:abstractNumId w:val="2"/>
+  </w:num>
+  <w:num w:numId="8">
+    <w:abstractNumId w:val="9"/>
+  </w:num>
+  <w:num w:numId="9">
     <w:abstractNumId w:val="0"/>
   </w:num>
-  <w:num w:numId="3">
-    <w:abstractNumId w:val="4"/>
+  <w:num w:numId="10">
+    <w:abstractNumId w:val="8"/>
   </w:num>
-  <w:num w:numId="4">
-    <w:abstractNumId w:val="2"/>
+  <w:num w:numId="11">
+    <w:abstractNumId w:val="6"/>
   </w:num>
-  <w:num w:numId="5">
-    <w:abstractNumId w:val="1"/>
+  <w:num w:numId="12">
+    <w:abstractNumId w:val="7"/>
   </w:num>
 </w:numbering>
 </file>
@@ -7082,6 +11107,27 @@
     <w:name w:val="Normal"/>
     <w:qFormat/>
   </w:style>
+  <w:style w:type="paragraph" w:styleId="Titolo1">
+    <w:name w:val="heading 1"/>
+    <w:basedOn w:val="Normale"/>
+    <w:next w:val="Normale"/>
+    <w:link w:val="Titolo1Carattere"/>
+    <w:uiPriority w:val="9"/>
+    <w:qFormat/>
+    <w:rsid w:val="00C67226"/>
+    <w:pPr>
+      <w:keepNext/>
+      <w:keepLines/>
+      <w:spacing w:before="240" w:after="0"/>
+      <w:outlineLvl w:val="0"/>
+    </w:pPr>
+    <w:rPr>
+      <w:rFonts w:asciiTheme="majorHAnsi" w:eastAsiaTheme="majorEastAsia" w:hAnsiTheme="majorHAnsi" w:cstheme="majorBidi"/>
+      <w:color w:val="2E74B5" w:themeColor="accent1" w:themeShade="BF"/>
+      <w:sz w:val="32"/>
+      <w:szCs w:val="32"/>
+    </w:rPr>
+  </w:style>
   <w:style w:type="paragraph" w:styleId="Titolo2">
     <w:name w:val="heading 2"/>
     <w:basedOn w:val="Normale"/>
@@ -7276,6 +11322,31 @@
     <w:name w:val="token"/>
     <w:basedOn w:val="Carpredefinitoparagrafo"/>
     <w:rsid w:val="00BE66B7"/>
+  </w:style>
+  <w:style w:type="character" w:styleId="Collegamentoipertestuale">
+    <w:name w:val="Hyperlink"/>
+    <w:basedOn w:val="Carpredefinitoparagrafo"/>
+    <w:uiPriority w:val="99"/>
+    <w:semiHidden/>
+    <w:unhideWhenUsed/>
+    <w:rsid w:val="00C67226"/>
+    <w:rPr>
+      <w:color w:val="0000FF"/>
+      <w:u w:val="single"/>
+    </w:rPr>
+  </w:style>
+  <w:style w:type="character" w:customStyle="1" w:styleId="Titolo1Carattere">
+    <w:name w:val="Titolo 1 Carattere"/>
+    <w:basedOn w:val="Carpredefinitoparagrafo"/>
+    <w:link w:val="Titolo1"/>
+    <w:uiPriority w:val="9"/>
+    <w:rsid w:val="00C67226"/>
+    <w:rPr>
+      <w:rFonts w:asciiTheme="majorHAnsi" w:eastAsiaTheme="majorEastAsia" w:hAnsiTheme="majorHAnsi" w:cstheme="majorBidi"/>
+      <w:color w:val="2E74B5" w:themeColor="accent1" w:themeShade="BF"/>
+      <w:sz w:val="32"/>
+      <w:szCs w:val="32"/>
+    </w:rPr>
   </w:style>
 </w:styles>
 </file>

</xml_diff>